<commit_message>
Exemples, captures et vignettes régénérés sur l'état corrigé
examples/ (29 pages au lieu de 21 : le dépôt publiait des livrables
antérieurs à l'analyse approfondie), captures du README (interface avec
complétude, maturité « 3/5 »), vignettes des gabarits. Relevé : DETTE § 23.

Co-Authored-By: Claude Opus 5.5 <noreply@anthropic.com>
</commit_message>
<xml_diff>
--- a/examples/Rapport-ESG.docx
+++ b/examples/Rapport-ESG.docx
@@ -168,6 +168,18 @@
               <w:t>70,0</w:t>
             </w:r>
           </w:p>
+          <w:p>
+            <w:pPr>
+              <w:jc w:val="center"/>
+            </w:pPr>
+            <w:r>
+              <w:rPr>
+                <w:color w:val="5F6B64"/>
+                <w:sz w:val="16"/>
+              </w:rPr>
+              <w:t>3/4 indicateurs notés</w:t>
+            </w:r>
+          </w:p>
         </w:tc>
         <w:tc>
           <w:tcPr>
@@ -186,6 +198,18 @@
               <w:t>65,0</w:t>
             </w:r>
           </w:p>
+          <w:p>
+            <w:pPr>
+              <w:jc w:val="center"/>
+            </w:pPr>
+            <w:r>
+              <w:rPr>
+                <w:color w:val="5F6B64"/>
+                <w:sz w:val="16"/>
+              </w:rPr>
+              <w:t>4/6 indicateurs notés</w:t>
+            </w:r>
+          </w:p>
         </w:tc>
         <w:tc>
           <w:tcPr>
@@ -202,6 +226,18 @@
                 <w:sz w:val="48"/>
               </w:rPr>
               <w:t>75,0</w:t>
+            </w:r>
+          </w:p>
+          <w:p>
+            <w:pPr>
+              <w:jc w:val="center"/>
+            </w:pPr>
+            <w:r>
+              <w:rPr>
+                <w:color w:val="5F6B64"/>
+                <w:sz w:val="16"/>
+              </w:rPr>
+              <w:t>6/8 indicateurs notés</w:t>
             </w:r>
           </w:p>
         </w:tc>
@@ -422,7 +458,7 @@
         <w:spacing w:after="240"/>
       </w:pPr>
       <w:r>
-        <w:t>Acme Industries consolide pour l'exercice 2025 son reporting de durabilité, ancré dans les réalités de l'industrie manufacturière, au cœur des défis d'efficacité carbone. Avec 69,5/100 et une note A, Acme Industries affiche une bonne performance sur la grille de notation interne sur l'ensemble du périmètre extra-financier. Gouvernance domine le profil ESG (75/100) tandis que Social (65/100) constitue la marge d'amélioration prioritaire. Au global, la maturité ESG est évaluée comme structurée (2/5). Combler les lacunes de reporting prioritaires — au premier rang desquelles la vérification par un tiers indépendant, requise par la CSRD (assurance limitée) — constitue le levier le plus rapide pour sécuriser la conformité CSRD et renforcer la confiance des investisseurs. Par rapport à l'exercice 2024, le score global progresse de 14 points (environnement +12, social +15, gouvernance +15). Depuis le précédent plan d'action, deux actions sont déclarées engagées, dont « Créer un comité de durabilité au conseil » et « Porter la formation à 20h/employé/an minimum ». Cette démarche s'appuie sur des initiatives déjà engagées, notamment le programme Cap Climat 2027 et l'installation photovoltaïque du site de Lyon.</w:t>
+        <w:t>Acme Industries consolide pour l'exercice 2025 son reporting de durabilité, ancré dans les réalités de l'industrie manufacturière, au cœur des défis d'efficacité carbone. Avec 69,5/100 et une note A, Acme Industries affiche une bonne performance sur la grille de notation interne sur l'ensemble du périmètre extra-financier. Gouvernance domine le profil ESG (75/100) tandis que Social (65/100) constitue la marge d'amélioration prioritaire. Au global, la maturité ESG est évaluée comme structurée (3/5). Combler les lacunes de reporting prioritaires — au premier rang desquelles la vérification par un tiers indépendant (assurance limitée, exigée des entreprises soumises à la CSRD) — constitue le levier le plus rapide pour renforcer la crédibilité du reporting et la confiance des investisseurs. Par rapport à l'exercice 2024, le score global progresse de 14 points (environnement +12, social +15, gouvernance +15). Depuis le précédent plan d'action, deux actions sont déclarées engagées, dont « Créer un comité de durabilité au conseil » et « Porter la formation à 20h/employé/an minimum ». Cette démarche s'appuie sur des initiatives déjà engagées, notamment le programme Cap Climat 2027 et l'installation photovoltaïque du site de Lyon.</w:t>
       </w:r>
     </w:p>
     <w:p>
@@ -450,6 +486,167 @@
           <w:sz w:val="20"/>
         </w:rPr>
         <w:t>La priorité 2026 est la fiabilisation du reporting énergie avant l'audit de certification prévu au troisième trimestre.</w:t>
+      </w:r>
+    </w:p>
+    <w:p>
+      <w:pPr>
+        <w:spacing w:before="280" w:after="120"/>
+        <w:jc w:val="left"/>
+      </w:pPr>
+      <w:r>
+        <w:rPr>
+          <w:rFonts w:ascii="Segoe UI" w:hAnsi="Segoe UI"/>
+          <w:b/>
+          <w:color w:val="1F3D33"/>
+          <w:sz w:val="34"/>
+        </w:rPr>
+        <w:t>Diagnostic d'ensemble</w:t>
+      </w:r>
+    </w:p>
+    <w:p>
+      <w:pPr>
+        <w:spacing w:before="280" w:after="120"/>
+        <w:jc w:val="left"/>
+      </w:pPr>
+      <w:r>
+        <w:rPr>
+          <w:rFonts w:ascii="Segoe UI" w:hAnsi="Segoe UI"/>
+          <w:b/>
+          <w:color w:val="1F3D33"/>
+          <w:sz w:val="24"/>
+        </w:rPr>
+        <w:t>Le profil qui se dégage</w:t>
+      </w:r>
+    </w:p>
+    <w:p>
+      <w:pPr>
+        <w:spacing w:after="160"/>
+      </w:pPr>
+      <w:r>
+        <w:rPr>
+          <w:i w:val="0"/>
+          <w:sz w:val="21"/>
+        </w:rPr>
+        <w:t>Le dossier d'Acme Industries fait ressortir 2 enjeux et un point d'appui. Les fragilités se concentrent sur le pilier de gouvernance : l'intégrité et la sécurité de l'information et le pilotage de la démarche. C'est là que le plan d'action doit porter en premier.</w:t>
+      </w:r>
+    </w:p>
+    <w:p>
+      <w:pPr>
+        <w:spacing w:after="160"/>
+      </w:pPr>
+      <w:r>
+        <w:rPr>
+          <w:i w:val="0"/>
+          <w:sz w:val="21"/>
+        </w:rPr>
+        <w:t>Les points d'appui sont la maîtrise des risques professionnels : ce sont eux qui donnent de la crédibilité au plan d'action.</w:t>
+      </w:r>
+    </w:p>
+    <w:p>
+      <w:pPr>
+        <w:spacing w:before="280" w:after="120"/>
+        <w:jc w:val="left"/>
+      </w:pPr>
+      <w:r>
+        <w:rPr>
+          <w:rFonts w:ascii="Segoe UI" w:hAnsi="Segoe UI"/>
+          <w:b/>
+          <w:color w:val="1F3D33"/>
+          <w:sz w:val="24"/>
+        </w:rPr>
+        <w:t>Les enjeux structurants</w:t>
+      </w:r>
+    </w:p>
+    <w:p>
+      <w:pPr>
+        <w:spacing w:after="160"/>
+      </w:pPr>
+      <w:r>
+        <w:rPr>
+          <w:i w:val="0"/>
+          <w:sz w:val="21"/>
+        </w:rPr>
+        <w:t>Les enjeux ci-dessous sont classés par gravité, telle que la mesurent les écarts à la grille du diagnostic et aux références disponibles.</w:t>
+      </w:r>
+    </w:p>
+    <w:p>
+      <w:pPr>
+        <w:keepNext/>
+        <w:spacing w:before="280" w:after="120"/>
+        <w:jc w:val="left"/>
+      </w:pPr>
+      <w:r>
+        <w:rPr>
+          <w:rFonts w:ascii="Segoe UI" w:hAnsi="Segoe UI"/>
+          <w:b/>
+          <w:color w:val="6B5B86"/>
+          <w:sz w:val="22"/>
+        </w:rPr>
+        <w:t>1. Des incidents d'intégrité déclarés</w:t>
+      </w:r>
+    </w:p>
+    <w:p>
+      <w:pPr>
+        <w:spacing w:after="160"/>
+      </w:pPr>
+      <w:r>
+        <w:rPr>
+          <w:i w:val="0"/>
+          <w:sz w:val="21"/>
+        </w:rPr>
+        <w:t>Une violation de données a été déclarée sur l'exercice.</w:t>
+      </w:r>
+    </w:p>
+    <w:p>
+      <w:pPr>
+        <w:spacing w:after="160"/>
+      </w:pPr>
+      <w:r>
+        <w:rPr>
+          <w:i w:val="0"/>
+          <w:sz w:val="21"/>
+        </w:rPr>
+        <w:t>Chaque violation de données entame la confiance des clients.</w:t>
+      </w:r>
+    </w:p>
+    <w:p>
+      <w:pPr>
+        <w:keepNext/>
+        <w:spacing w:before="280" w:after="120"/>
+        <w:jc w:val="left"/>
+      </w:pPr>
+      <w:r>
+        <w:rPr>
+          <w:rFonts w:ascii="Segoe UI" w:hAnsi="Segoe UI"/>
+          <w:b/>
+          <w:color w:val="6B5B86"/>
+          <w:sz w:val="22"/>
+        </w:rPr>
+        <w:t>2. Des données ESG non vérifiées</w:t>
+      </w:r>
+    </w:p>
+    <w:p>
+      <w:pPr>
+        <w:spacing w:after="160"/>
+      </w:pPr>
+      <w:r>
+        <w:rPr>
+          <w:i w:val="0"/>
+          <w:sz w:val="21"/>
+        </w:rPr>
+        <w:t>Les indicateurs publiés n'ont été contrôlés par aucun tiers.</w:t>
+      </w:r>
+    </w:p>
+    <w:p>
+      <w:pPr>
+        <w:spacing w:after="160"/>
+      </w:pPr>
+      <w:r>
+        <w:rPr>
+          <w:i w:val="0"/>
+          <w:sz w:val="21"/>
+        </w:rPr>
+        <w:t>Les chiffres publiés restent exposés à la contestation des partenaires financiers et des grands clients, qui accordent davantage de crédit à une information vérifiée.</w:t>
       </w:r>
     </w:p>
     <w:p>
@@ -530,6 +727,12 @@
           <w:sz w:val="28"/>
         </w:rPr>
         <w:t>70,0/100</w:t>
+      </w:r>
+      <w:r>
+        <w:rPr>
+          <w:sz w:val="20"/>
+        </w:rPr>
+        <w:t xml:space="preserve">  ·  3/4 indicateurs notés</w:t>
       </w:r>
     </w:p>
     <w:p>
@@ -985,6 +1188,221 @@
           <w:color w:val="2F6B4F"/>
           <w:sz w:val="34"/>
         </w:rPr>
+        <w:t>Analyse approfondie : ce que disent les chiffres environnementaux</w:t>
+      </w:r>
+    </w:p>
+    <w:p>
+      <w:pPr>
+        <w:keepNext/>
+        <w:spacing w:before="280" w:after="120"/>
+        <w:jc w:val="left"/>
+      </w:pPr>
+      <w:r>
+        <w:rPr>
+          <w:rFonts w:ascii="Segoe UI" w:hAnsi="Segoe UI"/>
+          <w:b/>
+          <w:color w:val="2F6B4F"/>
+          <w:sz w:val="22"/>
+        </w:rPr>
+        <w:t>Où se forme l'empreinte carbone</w:t>
+      </w:r>
+    </w:p>
+    <w:p>
+      <w:pPr>
+        <w:spacing w:after="160"/>
+      </w:pPr>
+      <w:r>
+        <w:rPr>
+          <w:i w:val="0"/>
+          <w:sz w:val="21"/>
+        </w:rPr>
+        <w:t>Sur les 8 200 t CO2e mesurées sur les scopes renseignés, le Scope 3 en représente 60 %, le Scope 2, 26 % et le Scope 1, 15 %. La majeure partie de l'empreinte se situe hors des murs, dans la chaîne de valeur : chez un industriel, elle recouvre matières premières et composants achetés, transport amont et aval, et parfois usage et fin de vie des produits vendus.</w:t>
+      </w:r>
+    </w:p>
+    <w:p>
+      <w:pPr>
+        <w:spacing w:after="160"/>
+      </w:pPr>
+      <w:r>
+        <w:rPr>
+          <w:i w:val="0"/>
+          <w:sz w:val="21"/>
+        </w:rPr>
+        <w:t>L'entreprise ne peut la réduire seule : elle dépend des choix de ses fournisseurs, de la conception de ses offres et de l'usage qu'en font ses clients. Elle en porte pourtant le risque, car une hausse du coût du carbone chez les fournisseurs finit par se retrouver dans les prix d'achat. Le chantier commence par les données : identifier les fournisseurs et les catégories d'achat qui pèsent le plus, obtenir leurs propres bilans, puis intégrer un critère carbone aux consultations.</w:t>
+      </w:r>
+    </w:p>
+    <w:p>
+      <w:pPr>
+        <w:keepNext/>
+        <w:spacing w:before="280" w:after="120"/>
+        <w:jc w:val="left"/>
+      </w:pPr>
+      <w:r>
+        <w:rPr>
+          <w:rFonts w:ascii="Segoe UI" w:hAnsi="Segoe UI"/>
+          <w:b/>
+          <w:color w:val="2F6B4F"/>
+          <w:sz w:val="22"/>
+        </w:rPr>
+        <w:t>Intensité carbone : ce que dit le ratio</w:t>
+      </w:r>
+    </w:p>
+    <w:p>
+      <w:pPr>
+        <w:spacing w:after="160"/>
+      </w:pPr>
+      <w:r>
+        <w:rPr>
+          <w:i w:val="0"/>
+          <w:sz w:val="21"/>
+        </w:rPr>
+        <w:t>Rapportées à l'activité, les 8 200 t CO2e déclarées représentent 171 t par million d'euros de chiffre d'affaires, soit 25,6 t par salarié. Pour un industriel, la grille sectorielle du diagnostic classe ce niveau comme satisfaisant.</w:t>
+      </w:r>
+    </w:p>
+    <w:p>
+      <w:pPr>
+        <w:spacing w:after="160"/>
+      </w:pPr>
+      <w:r>
+        <w:rPr>
+          <w:i w:val="0"/>
+          <w:sz w:val="21"/>
+        </w:rPr>
+        <w:t>L'entreprise n'est ni en avance ni en retard sur les acteurs comparables. C'est pourtant une position exposée à moyen terme : les attentes se déplacent, et ce qui est dans la moyenne aujourd'hui deviendra un retard dès que les concurrents auront engagé leur propre décarbonation.</w:t>
+      </w:r>
+    </w:p>
+    <w:p>
+      <w:pPr>
+        <w:keepNext/>
+        <w:spacing w:before="280" w:after="120"/>
+        <w:jc w:val="left"/>
+      </w:pPr>
+      <w:r>
+        <w:rPr>
+          <w:rFonts w:ascii="Segoe UI" w:hAnsi="Segoe UI"/>
+          <w:b/>
+          <w:color w:val="2F6B4F"/>
+          <w:sz w:val="22"/>
+        </w:rPr>
+        <w:t>Énergie : sobriété, efficacité, origine</w:t>
+      </w:r>
+    </w:p>
+    <w:p>
+      <w:pPr>
+        <w:spacing w:after="160"/>
+      </w:pPr>
+      <w:r>
+        <w:rPr>
+          <w:i w:val="0"/>
+          <w:sz w:val="21"/>
+        </w:rPr>
+        <w:t>L'entreprise a consommé 21 500 MWh sur l'exercice, soit 67,2 MWh par salarié et 448 MWh par million d'euros de chiffre d'affaires. 42 % de l'énergie consommée est d'origine renouvelable, un niveau satisfaisant selon la grille du diagnostic. Le niveau atteint montre qu'une politique d'achat existe ; il reste à la sécuriser dans la durée, par des contrats pluriannuels et une traçabilité de l'origine de l'énergie.</w:t>
+      </w:r>
+    </w:p>
+    <w:p>
+      <w:pPr>
+        <w:spacing w:after="160"/>
+      </w:pPr>
+      <w:r>
+        <w:rPr>
+          <w:i w:val="0"/>
+          <w:sz w:val="21"/>
+        </w:rPr>
+        <w:t>Dans l'industrie, les gisements d'efficacité se cachent souvent dans les utilités — air comprimé, froid, vapeur — et dans les moteurs, où la variation de vitesse et la chasse aux fuites produisent des gains rapides. Dans une démarche bien ordonnée, la sobriété précède l'efficacité, qui précède le verdissement : chaque mégawattheure évité est un gain à la fois économique et climatique, alors qu'un mégawattheure verdi reste une dépense.</w:t>
+      </w:r>
+    </w:p>
+    <w:p>
+      <w:pPr>
+        <w:keepNext/>
+        <w:spacing w:before="280" w:after="120"/>
+        <w:jc w:val="left"/>
+      </w:pPr>
+      <w:r>
+        <w:rPr>
+          <w:rFonts w:ascii="Segoe UI" w:hAnsi="Segoe UI"/>
+          <w:b/>
+          <w:color w:val="2F6B4F"/>
+          <w:sz w:val="22"/>
+        </w:rPr>
+        <w:t>Déchets et ressources</w:t>
+      </w:r>
+    </w:p>
+    <w:p>
+      <w:pPr>
+        <w:spacing w:after="160"/>
+      </w:pPr>
+      <w:r>
+        <w:rPr>
+          <w:i w:val="0"/>
+          <w:sz w:val="21"/>
+        </w:rPr>
+        <w:t>Chez un industriel, les gisements principaux sont en général les chutes de production, les emballages des matières premières, les déchets dangereux (huiles, solvants) et les rebuts de qualité. 63 % des déchets sont valorisés, un taux solide selon la grille du diagnostic.</w:t>
+      </w:r>
+    </w:p>
+    <w:p>
+      <w:pPr>
+        <w:spacing w:after="160"/>
+      </w:pPr>
+      <w:r>
+        <w:rPr>
+          <w:i w:val="0"/>
+          <w:sz w:val="21"/>
+        </w:rPr>
+        <w:t>Le tri et les filières sont en place. L'enjeu suivant est la réduction à la source, car un déchet bien recyclé reste une matière achetée puis perdue.</w:t>
+      </w:r>
+    </w:p>
+    <w:p>
+      <w:pPr>
+        <w:keepNext/>
+        <w:spacing w:before="280" w:after="120"/>
+        <w:jc w:val="left"/>
+      </w:pPr>
+      <w:r>
+        <w:rPr>
+          <w:rFonts w:ascii="Segoe UI" w:hAnsi="Segoe UI"/>
+          <w:b/>
+          <w:color w:val="2F6B4F"/>
+          <w:sz w:val="22"/>
+        </w:rPr>
+        <w:t>Eau</w:t>
+      </w:r>
+    </w:p>
+    <w:p>
+      <w:pPr>
+        <w:spacing w:after="160"/>
+      </w:pPr>
+      <w:r>
+        <w:rPr>
+          <w:i w:val="0"/>
+          <w:sz w:val="21"/>
+        </w:rPr>
+        <w:t>120 000 m³ d'eau ont été consommés sur l'exercice, soit 375 m³ par salarié. Chez un industriel, l'eau sert principalement à le refroidissement, le lavage des pièces et certains procédés.</w:t>
+      </w:r>
+    </w:p>
+    <w:p>
+      <w:pPr>
+        <w:spacing w:after="160"/>
+      </w:pPr>
+      <w:r>
+        <w:rPr>
+          <w:i w:val="0"/>
+          <w:sz w:val="21"/>
+        </w:rPr>
+        <w:t>Le diagnostic ne classe pas ce volume, faute de grille sectorielle défendable. Il invite en revanche à le suivre site par site : un même volume n'a pas le même enjeu dans un bassin en tension hydrique et dans un bassin excédentaire, et c'est cette géographie qui détermine le risque d'approvisionnement.</w:t>
+      </w:r>
+    </w:p>
+    <w:p>
+      <w:pPr>
+        <w:spacing w:before="280" w:after="120"/>
+        <w:jc w:val="left"/>
+      </w:pPr>
+      <w:r>
+        <w:rPr>
+          <w:rFonts w:ascii="Segoe UI" w:hAnsi="Segoe UI"/>
+          <w:b/>
+          <w:color w:val="2F6B4F"/>
+          <w:sz w:val="34"/>
+        </w:rPr>
         <w:t>Émissions de gaz à effet de serre (t CO2e)</w:t>
       </w:r>
     </w:p>
@@ -1051,6 +1469,12 @@
           <w:sz w:val="28"/>
         </w:rPr>
         <w:t>65,0/100</w:t>
+      </w:r>
+      <w:r>
+        <w:rPr>
+          <w:sz w:val="20"/>
+        </w:rPr>
+        <w:t xml:space="preserve">  ·  4/6 indicateurs notés</w:t>
       </w:r>
     </w:p>
     <w:p>
@@ -1375,6 +1799,153 @@
         <w:rPr>
           <w:rFonts w:ascii="Segoe UI" w:hAnsi="Segoe UI"/>
           <w:b/>
+          <w:color w:val="3D6A8A"/>
+          <w:sz w:val="34"/>
+        </w:rPr>
+        <w:t>Analyse approfondie : ce que disent les chiffres sociaux</w:t>
+      </w:r>
+    </w:p>
+    <w:p>
+      <w:pPr>
+        <w:keepNext/>
+        <w:spacing w:before="280" w:after="120"/>
+        <w:jc w:val="left"/>
+      </w:pPr>
+      <w:r>
+        <w:rPr>
+          <w:rFonts w:ascii="Segoe UI" w:hAnsi="Segoe UI"/>
+          <w:b/>
+          <w:color w:val="3D6A8A"/>
+          <w:sz w:val="22"/>
+        </w:rPr>
+        <w:t>Santé et sécurité au travail</w:t>
+      </w:r>
+    </w:p>
+    <w:p>
+      <w:pPr>
+        <w:spacing w:after="160"/>
+      </w:pPr>
+      <w:r>
+        <w:rPr>
+          <w:i w:val="0"/>
+          <w:sz w:val="21"/>
+        </w:rPr>
+        <w:t>Le taux de fréquence des accidents s'établit à 6,2, moins de la moitié de la moyenne nationale publiée par l'Assurance Maladie pour 2024 (16,0). Chez un industriel, la manutention, les machines, les chutes et les interventions de maintenance concentrent traditionnellement l'essentiel des risques.</w:t>
+      </w:r>
+    </w:p>
+    <w:p>
+      <w:pPr>
+        <w:spacing w:after="160"/>
+      </w:pPr>
+      <w:r>
+        <w:rPr>
+          <w:i w:val="0"/>
+          <w:sz w:val="21"/>
+        </w:rPr>
+        <w:t>Ce résultat témoigne d'une prévention installée. Il doit être protégé : un bon taux de fréquence peut coexister avec des risques graves mais rares, ou avec des troubles musculosquelettiques qui ne se traduisent pas immédiatement en arrêts. Le suivi de la gravité et des presque-accidents complète utilement l'indicateur.</w:t>
+      </w:r>
+    </w:p>
+    <w:p>
+      <w:pPr>
+        <w:keepNext/>
+        <w:spacing w:before="280" w:after="120"/>
+        <w:jc w:val="left"/>
+      </w:pPr>
+      <w:r>
+        <w:rPr>
+          <w:rFonts w:ascii="Segoe UI" w:hAnsi="Segoe UI"/>
+          <w:b/>
+          <w:color w:val="3D6A8A"/>
+          <w:sz w:val="22"/>
+        </w:rPr>
+        <w:t>Fidélisation et compétences</w:t>
+      </w:r>
+    </w:p>
+    <w:p>
+      <w:pPr>
+        <w:spacing w:after="160"/>
+      </w:pPr>
+      <w:r>
+        <w:rPr>
+          <w:i w:val="0"/>
+          <w:sz w:val="21"/>
+        </w:rPr>
+        <w:t>Avec un taux de rotation de 11 %, l'entreprise a vu partir l'équivalent d'environ 35 salariés sur l'exercice. Chaque salarié a suivi en moyenne 22 h de formation, soit de l'ordre de 7 040 heures au total.</w:t>
+      </w:r>
+    </w:p>
+    <w:p>
+      <w:pPr>
+        <w:spacing w:after="160"/>
+      </w:pPr>
+      <w:r>
+        <w:rPr>
+          <w:i w:val="0"/>
+          <w:sz w:val="21"/>
+        </w:rPr>
+        <w:t>Aucun des deux indicateurs n'appelle d'alerte, sans que l'un ou l'autre constitue un avantage distinctif. Les suivre par métier et par site permettrait de repérer les poches de fragilité que la moyenne masque.</w:t>
+      </w:r>
+    </w:p>
+    <w:p>
+      <w:pPr>
+        <w:keepNext/>
+        <w:spacing w:before="280" w:after="120"/>
+        <w:jc w:val="left"/>
+      </w:pPr>
+      <w:r>
+        <w:rPr>
+          <w:rFonts w:ascii="Segoe UI" w:hAnsi="Segoe UI"/>
+          <w:b/>
+          <w:color w:val="3D6A8A"/>
+          <w:sz w:val="22"/>
+        </w:rPr>
+        <w:t>Mixité des équipes</w:t>
+      </w:r>
+    </w:p>
+    <w:p>
+      <w:pPr>
+        <w:spacing w:after="160"/>
+      </w:pPr>
+      <w:r>
+        <w:rPr>
+          <w:i w:val="0"/>
+          <w:sz w:val="21"/>
+        </w:rPr>
+        <w:t>Les femmes représentent 34 % de l'effectif, soit environ 109 salariées. C'est en deçà du repère interne de 40 % retenu par ce diagnostic — un repère d'analyse, non une obligation légale.</w:t>
+      </w:r>
+    </w:p>
+    <w:p>
+      <w:pPr>
+        <w:spacing w:after="160"/>
+      </w:pPr>
+      <w:r>
+        <w:rPr>
+          <w:i w:val="0"/>
+          <w:sz w:val="21"/>
+        </w:rPr>
+        <w:t>L'industrie reste un secteur historiquement très masculin, en particulier dans les métiers de la production et de la maintenance. Le déséquilibre relève en partie des filières de formation, mais il réduit d'autant le vivier accessible pour des postes souvent difficiles à pourvoir. Un effectif déséquilibré se prive d'une partie des candidats, et donc de compétences, au moment où les recrutements se tendent.</w:t>
+      </w:r>
+    </w:p>
+    <w:p>
+      <w:pPr>
+        <w:spacing w:after="160"/>
+      </w:pPr>
+      <w:r>
+        <w:rPr>
+          <w:i w:val="0"/>
+          <w:sz w:val="21"/>
+        </w:rPr>
+        <w:t>Fait notable, le conseil (44 % de femmes) est plus féminisé que l'effectif : la gouvernance donne un signal que l'organisation ne suit pas encore.</w:t>
+      </w:r>
+    </w:p>
+    <w:p>
+      <w:pPr>
+        <w:spacing w:before="280" w:after="120"/>
+        <w:jc w:val="left"/>
+      </w:pPr>
+      <w:r>
+        <w:rPr>
+          <w:rFonts w:ascii="Segoe UI" w:hAnsi="Segoe UI"/>
+          <w:b/>
           <w:color w:val="6B5B86"/>
           <w:sz w:val="44"/>
         </w:rPr>
@@ -1444,6 +2015,12 @@
           <w:sz w:val="28"/>
         </w:rPr>
         <w:t>75,0/100</w:t>
+      </w:r>
+      <w:r>
+        <w:rPr>
+          <w:sz w:val="20"/>
+        </w:rPr>
+        <w:t xml:space="preserve">  ·  6/8 indicateurs notés</w:t>
       </w:r>
     </w:p>
     <w:p>
@@ -1760,6 +2337,105 @@
       </w:r>
     </w:p>
     <w:p>
+      <w:pPr>
+        <w:spacing w:before="280" w:after="120"/>
+        <w:jc w:val="left"/>
+      </w:pPr>
+      <w:r>
+        <w:rPr>
+          <w:rFonts w:ascii="Segoe UI" w:hAnsi="Segoe UI"/>
+          <w:b/>
+          <w:color w:val="6B5B86"/>
+          <w:sz w:val="34"/>
+        </w:rPr>
+        <w:t>Analyse approfondie : ce que disent les chiffres de gouvernance</w:t>
+      </w:r>
+    </w:p>
+    <w:p>
+      <w:pPr>
+        <w:keepNext/>
+        <w:spacing w:before="280" w:after="120"/>
+        <w:jc w:val="left"/>
+      </w:pPr>
+      <w:r>
+        <w:rPr>
+          <w:rFonts w:ascii="Segoe UI" w:hAnsi="Segoe UI"/>
+          <w:b/>
+          <w:color w:val="6B5B86"/>
+          <w:sz w:val="22"/>
+        </w:rPr>
+        <w:t>Pilotage de la démarche de durabilité</w:t>
+      </w:r>
+    </w:p>
+    <w:p>
+      <w:pPr>
+        <w:spacing w:after="160"/>
+      </w:pPr>
+      <w:r>
+        <w:rPr>
+          <w:i w:val="0"/>
+          <w:sz w:val="21"/>
+        </w:rPr>
+        <w:t>Un comité de durabilité existe, mais les données ESG ne font pas l'objet d'une vérification externe. Le pilotage repose donc sur des chiffres que personne d'extérieur n'a contrôlés : c'est une fragilité face aux banques, aux investisseurs et aux grands clients, qui accordent plus de crédit à une information vérifiée. Une revue externe ciblée sur quelques indicateurs clés constitue une première étape proportionnée.</w:t>
+      </w:r>
+    </w:p>
+    <w:p>
+      <w:pPr>
+        <w:keepNext/>
+        <w:spacing w:before="280" w:after="120"/>
+        <w:jc w:val="left"/>
+      </w:pPr>
+      <w:r>
+        <w:rPr>
+          <w:rFonts w:ascii="Segoe UI" w:hAnsi="Segoe UI"/>
+          <w:b/>
+          <w:color w:val="6B5B86"/>
+          <w:sz w:val="22"/>
+        </w:rPr>
+        <w:t>Le conseil d'administration</w:t>
+      </w:r>
+    </w:p>
+    <w:p>
+      <w:pPr>
+        <w:spacing w:after="160"/>
+      </w:pPr>
+      <w:r>
+        <w:rPr>
+          <w:i w:val="0"/>
+          <w:sz w:val="21"/>
+        </w:rPr>
+        <w:t>Le conseil compte 9 membres, dont 4 indépendants (45 %) et 4 femmes (44 %). Cette taille permet de réunir des compétences variées sans alourdir les délibérations.</w:t>
+      </w:r>
+    </w:p>
+    <w:p>
+      <w:pPr>
+        <w:keepNext/>
+        <w:spacing w:before="280" w:after="120"/>
+        <w:jc w:val="left"/>
+      </w:pPr>
+      <w:r>
+        <w:rPr>
+          <w:rFonts w:ascii="Segoe UI" w:hAnsi="Segoe UI"/>
+          <w:b/>
+          <w:color w:val="6B5B86"/>
+          <w:sz w:val="22"/>
+        </w:rPr>
+        <w:t>Éthique, intégrité et sécurité de l'information</w:t>
+      </w:r>
+    </w:p>
+    <w:p>
+      <w:pPr>
+        <w:spacing w:after="160"/>
+      </w:pPr>
+      <w:r>
+        <w:rPr>
+          <w:i w:val="0"/>
+          <w:sz w:val="21"/>
+        </w:rPr>
+        <w:t>Une violation de données a été déclarée. Chaque incident expose l'entreprise à des coûts de remédiation, à une perte de confiance des clients et, le cas échéant, à des obligations de notification. L'analyse des causes — erreur humaine, faille technique, prestataire — doit orienter le plan : sensibilisation, correctifs, exigences contractuelles envers les sous-traitants.</w:t>
+      </w:r>
+    </w:p>
+    <w:p>
       <w:r>
         <w:br w:type="page"/>
       </w:r>
@@ -2342,7 +3018,7 @@
         <w:rPr>
           <w:sz w:val="19"/>
         </w:rPr>
-        <w:t>Apporte l'assurance d'un tiers désormais requise par la CSRD ; renforce la confiance des investisseurs.</w:t>
+        <w:t>Apporte l'assurance d'un tiers indépendant, exigée des entreprises soumises à la CSRD ; renforce la confiance des investisseurs.</w:t>
       </w:r>
       <w:r>
         <w:rPr>
@@ -2774,7 +3450,7 @@
           <w:color w:val="5F6B64"/>
           <w:sz w:val="22"/>
         </w:rPr>
-        <w:t>Niveau de maturité ESG : Structurée (2/5)</w:t>
+        <w:t>Niveau de maturité ESG : Structurée (3/5)</w:t>
       </w:r>
     </w:p>
     <w:p>
@@ -3312,7 +3988,7 @@
         <w:rPr>
           <w:sz w:val="20"/>
         </w:rPr>
-        <w:t>[P2] Réglementaire — Parité sous la cible : risque réglementaire et d'attractivité (impact : modéré · probabilité : probable)</w:t>
+        <w:t>[P2] Social — Mixité de l'effectif déséquilibrée : risque d'attractivité employeur (impact : modéré · probabilité : probable)</w:t>
       </w:r>
     </w:p>
     <w:p>
@@ -3587,6 +4263,143 @@
           <w:color w:val="5F6B64"/>
           <w:sz w:val="34"/>
         </w:rPr>
+        <w:t>Ce que nous retenons</w:t>
+      </w:r>
+    </w:p>
+    <w:p>
+      <w:pPr>
+        <w:pStyle w:val="ListBullet"/>
+      </w:pPr>
+      <w:r>
+        <w:rPr>
+          <w:sz w:val="21"/>
+        </w:rPr>
+        <w:t>À capitaliser : un taux de fréquence de 6,2, bien en dessous de la moyenne nationale. Un acquis à protéger et à faire valoir auprès des clients et des candidats.</w:t>
+      </w:r>
+    </w:p>
+    <w:p>
+      <w:pPr>
+        <w:pStyle w:val="ListBullet"/>
+      </w:pPr>
+      <w:r>
+        <w:rPr>
+          <w:sz w:val="21"/>
+        </w:rPr>
+        <w:t>À traiter en priorité : des incidents d'intégrité déclarés. Chaque violation de données entame la confiance des clients.</w:t>
+      </w:r>
+    </w:p>
+    <w:p>
+      <w:pPr>
+        <w:spacing w:before="280" w:after="120"/>
+        <w:jc w:val="left"/>
+      </w:pPr>
+      <w:r>
+        <w:rPr>
+          <w:rFonts w:ascii="Segoe UI" w:hAnsi="Segoe UI"/>
+          <w:b/>
+          <w:color w:val="5F6B64"/>
+          <w:sz w:val="34"/>
+        </w:rPr>
+        <w:t>Si rien ne change d'ici 2030</w:t>
+      </w:r>
+    </w:p>
+    <w:p>
+      <w:pPr>
+        <w:spacing w:after="160"/>
+      </w:pPr>
+      <w:r>
+        <w:rPr>
+          <w:i w:val="0"/>
+          <w:sz w:val="21"/>
+        </w:rPr>
+        <w:t>Sans action, les tendances observées cette année se prolongeront.</w:t>
+      </w:r>
+    </w:p>
+    <w:p>
+      <w:pPr>
+        <w:spacing w:after="160"/>
+      </w:pPr>
+      <w:r>
+        <w:rPr>
+          <w:i w:val="0"/>
+          <w:sz w:val="21"/>
+        </w:rPr>
+        <w:t>Pour l'intégrité et la sécurité de l'information, chaque nouvel incident sera lu comme le signe d'un défaut de contrôle, avec des conséquences croissantes sur la réputation et les relations d'affaires.</w:t>
+      </w:r>
+    </w:p>
+    <w:p>
+      <w:pPr>
+        <w:spacing w:after="160"/>
+      </w:pPr>
+      <w:r>
+        <w:rPr>
+          <w:i w:val="0"/>
+          <w:sz w:val="21"/>
+        </w:rPr>
+        <w:t>Pour le pilotage de la démarche, la démarche restera dépendante de quelques personnes et difficile à rendre crédible à l'extérieur.</w:t>
+      </w:r>
+    </w:p>
+    <w:p>
+      <w:pPr>
+        <w:spacing w:before="280" w:after="120"/>
+        <w:jc w:val="left"/>
+      </w:pPr>
+      <w:r>
+        <w:rPr>
+          <w:rFonts w:ascii="Segoe UI" w:hAnsi="Segoe UI"/>
+          <w:b/>
+          <w:color w:val="5F6B64"/>
+          <w:sz w:val="34"/>
+        </w:rPr>
+        <w:t>Les 90 premiers jours</w:t>
+      </w:r>
+    </w:p>
+    <w:p>
+      <w:pPr>
+        <w:spacing w:after="160"/>
+      </w:pPr>
+      <w:r>
+        <w:rPr>
+          <w:i w:val="0"/>
+          <w:sz w:val="21"/>
+        </w:rPr>
+        <w:t>Ces décisions permettent d'engager le plan sans attendre les chantiers structurants :</w:t>
+      </w:r>
+    </w:p>
+    <w:p>
+      <w:pPr>
+        <w:pStyle w:val="ListNumber"/>
+      </w:pPr>
+      <w:r>
+        <w:rPr>
+          <w:sz w:val="21"/>
+        </w:rPr>
+        <w:t>Analyser les causes de chaque incident et vérifier que le dispositif d'alerte, les contrôles internes et la sensibilisation couvrent les situations rencontrées.</w:t>
+      </w:r>
+    </w:p>
+    <w:p>
+      <w:pPr>
+        <w:pStyle w:val="ListNumber"/>
+      </w:pPr>
+      <w:r>
+        <w:rPr>
+          <w:sz w:val="21"/>
+        </w:rPr>
+        <w:t>Faire revoir par un tiers deux ou trois indicateurs clés avant la prochaine publication.</w:t>
+      </w:r>
+    </w:p>
+    <w:p>
+      <w:pPr>
+        <w:spacing w:before="280" w:after="120"/>
+        <w:jc w:val="left"/>
+      </w:pPr>
+      <w:r>
+        <w:rPr>
+          <w:rFonts w:ascii="Segoe UI" w:hAnsi="Segoe UI"/>
+          <w:b/>
+          <w:color w:val="5F6B64"/>
+          <w:sz w:val="34"/>
+        </w:rPr>
         <w:t>Note méthodologique</w:t>
       </w:r>
     </w:p>
@@ -3599,7 +4412,7 @@
           <w:color w:val="5A6572"/>
           <w:sz w:val="17"/>
         </w:rPr>
-        <w:t>Périmètre et méthodologie du reporting. Référentiel visé : CSRD / ESRS. Les indicateurs couvrent l'exercice 2025 selon l'approche du contrôle opérationnel. Les émissions de gaz à effet de serre sont calculées selon le GHG Protocol (Scopes 1, 2 et 3) ; les indicateurs sociaux suivent les définitions de la norme ESRS S1 ; les indicateurs de gouvernance sont documentés à partir des registres de l'entreprise. Les scores par pilier (0-100) agrègent chaque indicateur sur une GRILLE DE NOTATION INTERNE, propre à l'outil : ses seuils ont été définis en interne et ne sont adossés à aucun référentiel externe publié. L'intensité carbone est notée sur une grille différenciée par famille sectorielle (services, industrie, transport, énergie…), elle aussi interne. La grille du taux de fréquence des accidents est ancrée sur le taux national publié par l'Assurance Maladie (16,0 en 2024, tous secteurs ; Assurance Maladie – Risques professionnels, rapport annuel 2024, tableau 8). Le score global est la moyenne pondérée des trois piliers, et la notation lettrée (échelle interne AAA-CCC) est indicative — elle ne constitue pas une notation d'agence. Le rapport ne comporte aucune comparaison à un référentiel sectoriel externe : le positionnement présenté est interne, il compare les trois piliers entre eux. Aucun transfert de données externe n'a lieu — l'ensemble du rapport est produit localement. Périmètre : ce rapport documente les indicateurs collectés pour l'exercice — bilan d'émissions par scope, indicateurs sociaux et de gouvernance, et parts déclarées comme alignées à la Taxonomie UE lorsqu'elles sont renseignées. Il ne constitue ni une vérification par un tiers, ni une déclaration de conformité à un cadre de reporting, ni un engagement de l'organisation. Limites : certains indicateurs reposent sur des données déclaratives et des estimations ; ils sont affinés à mesure que les dispositifs de mesure gagnent en maturité. Les points de données suivants restent à consolider : la vérification par un tiers indépendant, requise par la CSRD (assurance limitée).</w:t>
+        <w:t>Périmètre et méthodologie du reporting. Référentiel visé : CSRD / ESRS. Le référentiel CSRD / ESRS sert ici de cadre de lecture ; le rapport ne se prononce pas sur l'assujettissement de l'entreprise à la CSRD. Pour mémoire, la loi n° 2025-391 du 30 avril 2025 a reporté aux exercices ouverts à compter de 2027 l'obligation des grandes entreprises qui n'y étaient pas soumises dès 2024, et la directive (UE) 2026/470, à transposer au plus tard le 19 mars 2027, la réserve aux entreprises de plus de 1 000 salariés réalisant plus de 450 M€ de chiffre d'affaires net. Les indicateurs couvrent l'exercice 2025 selon l'approche du contrôle opérationnel. Les émissions de gaz à effet de serre sont calculées selon le GHG Protocol (Scopes 1, 2 et 3) ; les indicateurs sociaux suivent les définitions de la norme ESRS S1 ; les indicateurs de gouvernance sont documentés à partir des registres de l'entreprise. Les scores par pilier (0-100) agrègent chaque indicateur sur une GRILLE DE NOTATION INTERNE, propre à l'outil : ses seuils ont été définis en interne et ne sont adossés à aucun référentiel externe publié. L'intensité carbone est notée sur une grille différenciée par famille sectorielle (services, industrie, transport, énergie…), elle aussi interne. La mixité de l'effectif est lue au regard de repères internes au diagnostic (40 % de femmes sépare un point fort d'un axe d'amélioration ; paliers de notation à 15/25/35/45 %) : aucun quota légal ne porte sur la mixité de l'effectif total. La grille du taux de fréquence des accidents est ancrée sur le taux national publié par l'Assurance Maladie (16,0 en 2024, tous secteurs ; Assurance Maladie – Risques professionnels, rapport annuel 2024, tableau 8). Le score global est la moyenne pondérée des piliers notés (pondérations 40/35/25, renormalisées quand un pilier n'est pas noté) ; un pilier n'est noté qu'à partir de 3 indicateurs de sa grille (seuil interne à l'outil) — en deçà, il n'est pas noté plutôt que de recevoir un score, et le nombre d'indicateurs notés figure à côté de chaque score ; sous deux piliers notés il n'y a ni score global ni notation lettrée. Une évolution d'un exercice à l'autre compare des scores globaux qui peuvent reposer sur des piliers différents. La notation lettrée (échelle interne AAA-CCC) est indicative — elle ne constitue pas une notation d'agence. Le rapport ne comporte aucune comparaison à un référentiel sectoriel externe : le positionnement présenté est interne, il compare les trois piliers entre eux. Aucun transfert de données externe n'a lieu — l'ensemble du rapport est produit localement. Périmètre : ce rapport documente les indicateurs collectés pour l'exercice — bilan d'émissions par scope, indicateurs sociaux et de gouvernance, et parts déclarées comme alignées à la Taxonomie UE lorsqu'elles sont renseignées. Il ne constitue ni une vérification par un tiers, ni une déclaration de conformité à un cadre de reporting, ni un engagement de l'organisation. Limites : certains indicateurs reposent sur des données déclaratives et des estimations ; ils sont affinés à mesure que les dispositifs de mesure gagnent en maturité. Les points de données suivants restent à consolider : la vérification par un tiers indépendant (assurance limitée, exigée des entreprises soumises à la CSRD).</w:t>
       </w:r>
     </w:p>
     <w:p>
@@ -3922,7 +4735,7 @@
               <w:rPr>
                 <w:sz w:val="17"/>
               </w:rPr>
-              <w:t>Niveau de vérification par un tiers indépendant requis par la CSRD : le vérificateur conclut qu'il n'a pas relevé d'anomalie significative, sans l'audit approfondi que suppose une assurance raisonnable.</w:t>
+              <w:t>Niveau de vérification par un tiers indépendant exigé des entreprises soumises à la CSRD : le vérificateur conclut qu'il n'a pas relevé d'anomalie significative, sans l'audit approfondi que suppose une assurance raisonnable.</w:t>
             </w:r>
           </w:p>
         </w:tc>

</xml_diff>

<commit_message>
Exactitude : le risque « intensité carbone élevée » suit la grille sectorielle
DETTE § 24. Le risque se déclenchait au-delà de 100 t CO2e/M€ quel que soit
le secteur, pendant que la synthèse jugeait la même intensité « solide pour
le secteur » : une énergéticienne à 121 t/M€ recevait les deux. Le risque lit
désormais la tranche de bands.classer (fragile ou critique). Sur 300 profils,
181 → 168 dossiers exposés. Exemples, captures et vignettes régénérés.

Co-Authored-By: Claude Opus 5.5 <noreply@anthropic.com>
</commit_message>
<xml_diff>
--- a/examples/Rapport-ESG.docx
+++ b/examples/Rapport-ESG.docx
@@ -527,7 +527,7 @@
           <w:i w:val="0"/>
           <w:sz w:val="21"/>
         </w:rPr>
-        <w:t>Le dossier d'Acme Industries fait ressortir 2 enjeux et un point d'appui. Les fragilités se concentrent sur le pilier de gouvernance : l'intégrité et la sécurité de l'information et le pilotage de la démarche. C'est là que le plan d'action doit porter en premier.</w:t>
+        <w:t>Le dossier d'Acme Industries fait ressortir 2 enjeux et un point d'appui. Les enjeux repérés relèvent surtout du pilier de gouvernance : l'intégrité et la sécurité de l'information et le pilotage de la démarche. C'est là que le plan d'action doit porter en premier.</w:t>
       </w:r>
     </w:p>
     <w:p>
@@ -3969,7 +3969,7 @@
         <w:rPr>
           <w:sz w:val="20"/>
         </w:rPr>
-        <w:t>[P2] Transition — Intensité carbone élevée : marge exposée à la tarification du carbone (impact : élevé · probabilité : possible)</w:t>
+        <w:t>[P2] Transition — Dépendance énergie fossile : exposition à la hausse des prix (impact : modéré · probabilité : probable)</w:t>
       </w:r>
     </w:p>
     <w:p>

</xml_diff>

<commit_message>
Exactitude : plus aucune phrase n'affirme un plan, un engagement ou une vérification non déclarés
DETTE § 22. Revue des 36 listes de phrases de content_generator : audit qui
« garantit les données de ce rapport » ou « est planifié », comité
« permanent » qui « rend compte au Conseil », « feuille de route » et
« stratégie pluriannuelle » prêtées au client, politique RH inventée, Scope 3
« couvrant toute la chaîne de valeur », conclusion où l'entreprise
« s'engage » et « réaffirme son engagement ». Réécrit en constat ou en
recommandation, FR/EN. Le repli « aucun point fort » n'est plus compté comme
un point fort. Garde-fou : invariant aucune_affirmation_non_declaree.

Co-Authored-By: Claude Opus 5.5 <noreply@anthropic.com>
</commit_message>
<xml_diff>
--- a/examples/Rapport-ESG.docx
+++ b/examples/Rapport-ESG.docx
@@ -1482,7 +1482,7 @@
         <w:spacing w:after="160"/>
       </w:pPr>
       <w:r>
-        <w:t>Acme Industries enregistre 65/100 sur l'axe social de son reporting extra-financier. Le bilan social présente : 320 collaborateurs (France) ; 34 % de femmes dans l'effectif ; 22 h/an de formation par collaborateur (satisfaisant) ; taux de fréquence accidents 6,2 (inférieur ou égal à la moyenne nationale de 16,0) ; turnover 11 %. La démarche sociale combine montée en compétences, dialogue social renforcé et inclusion durable.</w:t>
+        <w:t>Acme Industries enregistre 65/100 sur l'axe social de son reporting extra-financier. Le bilan social présente : 320 collaborateurs (France) ; 34 % de femmes dans l'effectif ; 22 h/an de formation par collaborateur (satisfaisant) ; taux de fréquence accidents 6,2 (inférieur ou égal à la moyenne nationale de 16,0) ; turnover 11 %.</w:t>
       </w:r>
     </w:p>
     <w:tbl>
@@ -2028,7 +2028,7 @@
         <w:spacing w:after="160"/>
       </w:pPr>
       <w:r>
-        <w:t>Acme Industries positionne son axe Gouvernance à 75/100. L'architecture de gouvernance comprend : CA de 9 membres ; 44 % de femmes au CA (les données saisies placent l'entreprise hors du champ de la loi Copé-Zimmermann, art. L225-18-1 du Code de commerce : 40 % de chaque sexe dans les sociétés d'au moins 250 salariés permanents et 50 M€ de chiffre d'affaires ou de total de bilan, trois exercices consécutifs) ; 45 % d'administrateurs indépendants ; aucun manquement éthique enregistré ; un incident cybersécurité déclaré. Le déploiement d'une certification ESG externe constitue un axe de progrès à court terme. La supervision ESG est assurée par un comité dédié qui rend compte directement au Conseil.</w:t>
+        <w:t>Acme Industries positionne son axe Gouvernance à 75/100. L'architecture de gouvernance comprend : CA de 9 membres ; 44 % de femmes au CA (les données saisies placent l'entreprise hors du champ de la loi Copé-Zimmermann, art. L225-18-1 du Code de commerce : 40 % de chaque sexe dans les sociétés d'au moins 250 salariés permanents et 50 M€ de chiffre d'affaires ou de total de bilan, trois exercices consécutifs) ; 45 % d'administrateurs indépendants ; aucun manquement éthique enregistré ; un incident cybersécurité déclaré. Le déploiement d'une certification ESG externe constitue un axe de progrès à court terme. Les enjeux ESG disposent d'une instance dédiée au niveau du Conseil.</w:t>
       </w:r>
     </w:p>
     <w:tbl>
@@ -2686,7 +2686,7 @@
         <w:rPr>
           <w:sz w:val="20"/>
         </w:rPr>
-        <w:t>Comité de durabilité opérationnel au niveau du CA</w:t>
+        <w:t>Comité de durabilité en place au niveau du CA</w:t>
       </w:r>
     </w:p>
     <w:p>
@@ -4248,7 +4248,7 @@
     </w:p>
     <w:p>
       <w:r>
-        <w:t>Fort d'un score ESG de 69,5/100 (A), Acme Industries amorce une dynamique positive sur l'ensemble des piliers ESG. L'analyse met en lumière cinq points forts consolidés et quatre axes d'amélioration prioritaires. Portée par ces premiers résultats, Acme Industries structure une trajectoire de progrès sur les prochains exercices, en s'appuyant sur les 4 recommandations formulées comme feuille de route opérationnelle. L'organisation réaffirme son engagement envers un reporting transparent et rigoureux, selon le référentiel de reporting visé pour cet exercice.</w:t>
+        <w:t>Avec un score ESG de 69,5/100 (A), Acme Industries se situe au milieu de la grille de notation interne. L'analyse met en lumière cinq points forts consolidés et quatre axes d'amélioration prioritaires. Dans cette perspective, les 4 recommandations formulées constituent la feuille de route proposée ; leur mise en œuvre relève des arbitrages d'Acme Industries. Ce diagnostic est établi selon le référentiel de reporting visé pour cet exercice.</w:t>
       </w:r>
     </w:p>
     <w:p>

</xml_diff>

<commit_message>
Étape B, lot 1 : trajectoire climat déclarée par le client
DETTE § 0bis. Nouvelle étape « Objectifs » du wizard : réduction visée,
année de référence, année cible, périmètre (scopes 1-2 ou 1-2-3). Une cible
complète est citée comme déclarée par l'entreprise, avec le rythme annuel
moyen et, si la référence est l'exercice du rapport, la cible en tonnes ;
jamais d'alignement 1,5 °C ou SBTi (règle 9). Texte « Objectifs », ligne
ESRS E1-4 (« cible déclarée »), livre blanc, questionnaire, import CSV.
Une saisie partielle vaut absence. Les anciens dossiers se relisent sans
changement. Invariant du banc : cible_citee_est_la_cible_saisie.
Relevé : DETTE § 25 (trois libellés d'interface).

Co-Authored-By: Claude Opus 5.5 <noreply@anthropic.com>
</commit_message>
<xml_diff>
--- a/examples/Rapport-ESG.docx
+++ b/examples/Rapport-ESG.docx
@@ -2506,7 +2506,7 @@
         <w:spacing w:after="120"/>
       </w:pPr>
       <w:r>
-        <w:t>À la date de ce rapport, Acme Industries n'a pas communiqué d'objectifs de durabilité chiffrés à horizon 2030 : ni trajectoire de réduction des émissions, ni cible de progression par pilier. Le bilan d'émissions étant établi pour l'exercice 2025, il fournit l'année de référence à partir de laquelle une trajectoire de réduction peut être définie. La norme ESRS E1-4 demande de publier si et comment des cibles de réduction ont été fixées — leur absence, documentée comme telle, relève de cette même exigence de transparence.</w:t>
+        <w:t>Acme Industries déclare un objectif de réduction de ses émissions de gaz à effet de serre de 42 % entre 2025 et 2030 (scopes 1 et 2), soit une baisse moyenne équivalente à 8,4 % des émissions de 2025 chaque année. Rapportée au bilan 2025, la cible correspond à environ 1 914 t CO₂e en 2030. Cet objectif est celui que l'entreprise a communiqué : ce rapport le documente sans évaluer son alignement sur une trajectoire de référence. La norme ESRS E1-4 demande de publier si et comment des cibles de réduction ont été fixées : la cible ci-dessus en constitue la déclaration.</w:t>
       </w:r>
     </w:p>
     <w:p>
@@ -3482,7 +3482,7 @@
           <w:i w:val="0"/>
           <w:sz w:val="21"/>
         </w:rPr>
-        <w:t>Le tableau ci-dessous examine 6 exigences de reporting du référentiel CSRD / ESRS : 4 sont couvertes par les données de l'exercice, 1 reste ouverte ou partiellement couverte. Chaque ligne indique la référence concernée et ce qui manque pour la couvrir.</w:t>
+        <w:t>Le tableau ci-dessous examine 6 exigences de reporting du référentiel CSRD / ESRS : 5 sont couvertes par les données de l'exercice, 1 reste ouverte ou partiellement couverte. Chaque ligne indique la référence concernée et ce qui manque pour la couvrir.</w:t>
       </w:r>
     </w:p>
     <w:tbl>
@@ -3884,10 +3884,10 @@
             <w:r>
               <w:rPr>
                 <w:b/>
-                <w:color w:val="7F8C8D"/>
+                <w:color w:val="37474F"/>
                 <w:sz w:val="18"/>
               </w:rPr>
-              <w:t>Non couvert par ce reporting</w:t>
+              <w:t>Publié</w:t>
             </w:r>
           </w:p>
         </w:tc>
@@ -3900,7 +3900,7 @@
               <w:rPr>
                 <w:sz w:val="18"/>
               </w:rPr>
-              <w:t>Cibles climatiques non documentées dans ce reporting</w:t>
+              <w:t>Cible déclarée : −42 % entre 2025 et 2030 (scopes 1 et 2)</w:t>
             </w:r>
           </w:p>
         </w:tc>

</xml_diff>

<commit_message>
Étape B, lot 2 : cibles par indicateur et écart à la cible
Renouvelable, part de femmes, heures de formation, taux de fréquence, à
l'horizon des objectifs. Le texte « Objectifs » et la lecture de chaque
pilier donnent l'écart à combler (ou « cible déjà atteinte », ou valeur de
l'exercice non renseignée). La cible du client remplace l'objectif proposé
par l'outil : point faible (« objectif 50 % »), recommandations, titre et
colonne Objectif du plan d'action. Questionnaire, import CSV, interface.
Invariant du banc : cibles_indicateurs_citees_telles_quelles.

Co-Authored-By: Claude Opus 5.5 <noreply@anthropic.com>
</commit_message>
<xml_diff>
--- a/examples/Rapport-ESG.docx
+++ b/examples/Rapport-ESG.docx
@@ -1161,7 +1161,7 @@
           <w:i w:val="0"/>
           <w:sz w:val="21"/>
         </w:rPr>
-        <w:t>La consommation d'énergie atteint 21 500 MWh, soit 67,2 MWh par salarié. La consommation d'eau de l'exercice est de 120 000 m3. Restent à documenter : le volume de déchets et les initiatives en faveur de la biodiversité. Leur collecte, au prochain exercice, fiabilisera la lecture de ce pilier.</w:t>
+        <w:t>La consommation d'énergie atteint 21 500 MWh, soit 67,2 MWh par salarié. La consommation d'eau de l'exercice est de 120 000 m3. Restent à documenter : le volume de déchets et les initiatives en faveur de la biodiversité. Leur collecte, au prochain exercice, fiabilisera la lecture de ce pilier. L'entreprise s'est fixé, à horizon 2030, les cibles suivantes : part d'énergie renouvelable : 60 % (42 % sur l'exercice, soit 18 points à gagner d'ici 2030).</w:t>
       </w:r>
     </w:p>
     <w:p>
@@ -1173,7 +1173,7 @@
           <w:i w:val="0"/>
           <w:sz w:val="21"/>
         </w:rPr>
-        <w:t>Le plan d'action retient un levier pour ce pilier : augmenter la part d'énergie renouvelable à 50 % (objectif : 50 % d'énergie renouvelable dans le mix ; échéance : 2027).</w:t>
+        <w:t>Le plan d'action retient un levier pour ce pilier : atteindre la cible de 60 % d'énergie renouvelable fixée pour 2030 (objectif : cible de l'entreprise : 60 % en 2030 ; échéance : 2027).</w:t>
       </w:r>
     </w:p>
     <w:p>
@@ -1775,7 +1775,7 @@
           <w:i w:val="0"/>
           <w:sz w:val="21"/>
         </w:rPr>
-        <w:t>L'effectif s'établit à 320 collaborateurs sur l'exercice. Restent à documenter : le nombre d'accidents du travail, l'investissement communautaire, la part d'achats locaux, la satisfaction client et l'emploi de personnes en situation de handicap. Leur collecte, au prochain exercice, fiabilisera la lecture de ce pilier.</w:t>
+        <w:t>L'effectif s'établit à 320 collaborateurs sur l'exercice. Restent à documenter : le nombre d'accidents du travail, l'investissement communautaire, la part d'achats locaux, la satisfaction client et l'emploi de personnes en situation de handicap. Leur collecte, au prochain exercice, fiabilisera la lecture de ce pilier. L'entreprise s'est fixé, à horizon 2030, les cibles suivantes : heures de formation par salarié : 30 h (22 h sur l'exercice, soit 8 h à gagner d'ici 2030).</w:t>
       </w:r>
     </w:p>
     <w:p>
@@ -2506,7 +2506,7 @@
         <w:spacing w:after="120"/>
       </w:pPr>
       <w:r>
-        <w:t>Acme Industries déclare un objectif de réduction de ses émissions de gaz à effet de serre de 42 % entre 2025 et 2030 (scopes 1 et 2), soit une baisse moyenne équivalente à 8,4 % des émissions de 2025 chaque année. Rapportée au bilan 2025, la cible correspond à environ 1 914 t CO₂e en 2030. Cet objectif est celui que l'entreprise a communiqué : ce rapport le documente sans évaluer son alignement sur une trajectoire de référence. La norme ESRS E1-4 demande de publier si et comment des cibles de réduction ont été fixées : la cible ci-dessus en constitue la déclaration.</w:t>
+        <w:t>Acme Industries déclare un objectif de réduction de ses émissions de gaz à effet de serre de 42 % entre 2025 et 2030 (scopes 1 et 2), soit une baisse moyenne équivalente à 8,4 % des émissions de 2025 chaque année. Rapportée au bilan 2025, la cible correspond à environ 1 914 t CO₂e en 2030. Cibles déclarées par l'entreprise à horizon 2030 : part d'énergie renouvelable : 60 % (42 % sur l'exercice, soit 18 points à gagner d'ici 2030) ; heures de formation par salarié : 30 h (22 h sur l'exercice, soit 8 h à gagner d'ici 2030). Ces objectifs sont ceux que l'entreprise a communiqués : ce rapport les documente sans évaluer leur alignement sur une trajectoire de référence. La norme ESRS E1-4 demande de publier si et comment des cibles de réduction ont été fixées : la cible ci-dessus en constitue la déclaration.</w:t>
       </w:r>
     </w:p>
     <w:p>
@@ -2777,7 +2777,7 @@
         <w:rPr>
           <w:sz w:val="20"/>
         </w:rPr>
-        <w:t>Énergie renouvelable à renforcer (actuellement 42 %, objectif 50 %)</w:t>
+        <w:t>Énergie renouvelable à renforcer (actuellement 42 %, cible de l'entreprise : 60 % en 2030)</w:t>
       </w:r>
     </w:p>
     <w:p>
@@ -2928,7 +2928,7 @@
           <w:b/>
           <w:sz w:val="21"/>
         </w:rPr>
-        <w:t>Augmenter la part d'énergie renouvelable à 50 %</w:t>
+        <w:t>Atteindre la cible de 60 % d'énergie renouvelable fixée pour 2030</w:t>
       </w:r>
     </w:p>
     <w:p>
@@ -2948,7 +2948,7 @@
           <w:sz w:val="17"/>
         </w:rPr>
         <w:br/>
-        <w:t>Objectif : 50 % d'énergie renouvelable dans le mix  ·  Responsable : Direction des opérations  ·  2027</w:t>
+        <w:t>Objectif : Cible de l'entreprise : 60 % en 2030  ·  Responsable : Direction des opérations  ·  2027</w:t>
       </w:r>
     </w:p>
     <w:p>
@@ -4215,7 +4215,7 @@
         <w:rPr>
           <w:sz w:val="20"/>
         </w:rPr>
-        <w:t>Augmenter la part d'énergie renouvelable à 50 %</w:t>
+        <w:t>Atteindre la cible de 60 % d'énergie renouvelable fixée pour 2030</w:t>
       </w:r>
     </w:p>
     <w:p>

</xml_diff>

<commit_message>
Évolution depuis l'exercice N-1, indicateur par indicateur
Comparaison N-1, lot C (DETTE § 0). evolution.py compare chaque indicateur
présent sur les deux exercices : variation, lecture « en progrès / en
recul / stable » tirée de bands (grilles et compteurs de pénalité) — sans
jugement quand bands n'en définit pas —, intensité carbone plutôt que
tonnes, indicateurs apparus ou disparus. Section en tête du Diagnostic
(PDF, Word, notes PPTX) ; le classement interne des piliers reste en repli.

Cause racine d'un défaut de rendu : pdf_kit.clean supprimait en silence tout
caractère hors cp1252 (« −26,9 » s'imprimait « 26,9 », « 0 → 1 » « 0 1 ») ;
« − » et « → » sont translittérés, et le banc vérifie désormais qu'aucun
caractère ne se perd à l'impression. Relevé : DETTE § 26.

Co-Authored-By: Claude Opus 5.5 <noreply@anthropic.com>
</commit_message>
<xml_diff>
--- a/examples/Rapport-ESG.docx
+++ b/examples/Rapport-ESG.docx
@@ -458,7 +458,7 @@
         <w:spacing w:after="240"/>
       </w:pPr>
       <w:r>
-        <w:t>Acme Industries consolide pour l'exercice 2025 son reporting de durabilité, ancré dans les réalités de l'industrie manufacturière, au cœur des défis d'efficacité carbone. Avec 69,5/100 et une note A, Acme Industries affiche une bonne performance sur la grille de notation interne sur l'ensemble du périmètre extra-financier. Gouvernance domine le profil ESG (75/100) tandis que Social (65/100) constitue la marge d'amélioration prioritaire. Au global, la maturité ESG est évaluée comme structurée (3/5). Combler les lacunes de reporting prioritaires — au premier rang desquelles la vérification par un tiers indépendant (assurance limitée, exigée des entreprises soumises à la CSRD) — constitue le levier le plus rapide pour renforcer la crédibilité du reporting et la confiance des investisseurs. Par rapport à l'exercice 2024, le score global progresse de 14 points (environnement +12, social +15, gouvernance +15). Depuis le précédent plan d'action, deux actions sont déclarées engagées, dont « Créer un comité de durabilité au conseil » et « Porter la formation à 20h/employé/an minimum ». Cette démarche s'appuie sur des initiatives déjà engagées, notamment le programme Cap Climat 2027 et l'installation photovoltaïque du site de Lyon.</w:t>
+        <w:t>Acme Industries consolide pour l'exercice 2025 son reporting de durabilité, ancré dans les réalités de l'industrie manufacturière, au cœur des défis d'efficacité carbone. Avec 69,5/100 et une note A, Acme Industries affiche une bonne performance sur la grille de notation interne sur l'ensemble du périmètre extra-financier. Gouvernance domine le profil ESG (75/100) tandis que Social (65/100) constitue la marge d'amélioration prioritaire. Au global, la maturité ESG est évaluée comme structurée (3/5). Combler les lacunes de reporting prioritaires — au premier rang desquelles la vérification par un tiers indépendant (assurance limitée, exigée des entreprises soumises à la CSRD) — constitue le levier le plus rapide pour renforcer la crédibilité du reporting et la confiance des investisseurs. Par rapport à l'exercice 2024, le score global progresse de 6 points (environnement +10, social +10, gouvernance -5). Depuis le précédent plan d'action, deux actions sont déclarées engagées, dont « Créer un comité de durabilité au conseil » et « Porter la formation à 20h/employé/an minimum ». Cette démarche s'appuie sur des initiatives déjà engagées, notamment le programme Cap Climat 2027 et l'installation photovoltaïque du site de Lyon.</w:t>
       </w:r>
     </w:p>
     <w:p>
@@ -3091,6 +3091,1344 @@
         </w:pBdr>
       </w:pPr>
     </w:p>
+    <w:p>
+      <w:r>
+        <w:rPr>
+          <w:b/>
+          <w:color w:val="5F6B64"/>
+          <w:sz w:val="24"/>
+        </w:rPr>
+        <w:t>Évolution depuis l'exercice 2024</w:t>
+      </w:r>
+    </w:p>
+    <w:p>
+      <w:pPr>
+        <w:spacing w:after="80"/>
+      </w:pPr>
+      <w:r>
+        <w:rPr>
+          <w:i w:val="0"/>
+          <w:sz w:val="21"/>
+        </w:rPr>
+        <w:t>Par rapport à l'exercice 2024, 17 indicateurs sont comparables : 7 en progrès, 1 en recul, 5 stables, 4 sans sens de lecture défini. Principales évolutions : les incidents de cybersécurité de 0 à 1 (+1) ; le taux de fréquence des accidents de 8,1 à 6,2 (-1,9) ; les heures de formation de 18 h à 22 h (+4 h) ; la part d'énergie renouvelable de 35 % à 42 % (+7 pts).</w:t>
+      </w:r>
+    </w:p>
+    <w:tbl>
+      <w:tblPr>
+        <w:tblStyle w:val="TableGrid"/>
+        <w:tblW w:type="auto" w:w="0"/>
+        <w:tblLook w:firstColumn="1" w:firstRow="1" w:lastColumn="0" w:lastRow="0" w:noHBand="0" w:noVBand="1" w:val="04A0"/>
+      </w:tblPr>
+      <w:tblGrid>
+        <w:gridCol w:w="1881"/>
+        <w:gridCol w:w="1881"/>
+        <w:gridCol w:w="1881"/>
+        <w:gridCol w:w="1881"/>
+        <w:gridCol w:w="1881"/>
+      </w:tblGrid>
+      <w:tr>
+        <w:tc>
+          <w:tcPr>
+            <w:tcW w:type="dxa" w:w="1881"/>
+            <w:shd w:val="clear" w:fill="E6E6DC"/>
+          </w:tcPr>
+          <w:p>
+            <w:r>
+              <w:rPr>
+                <w:b/>
+                <w:sz w:val="18"/>
+              </w:rPr>
+              <w:t>Indicateur</w:t>
+            </w:r>
+          </w:p>
+        </w:tc>
+        <w:tc>
+          <w:tcPr>
+            <w:tcW w:type="dxa" w:w="1881"/>
+            <w:shd w:val="clear" w:fill="E6E6DC"/>
+          </w:tcPr>
+          <w:p>
+            <w:r>
+              <w:rPr>
+                <w:b/>
+                <w:sz w:val="18"/>
+              </w:rPr>
+              <w:t>2024</w:t>
+            </w:r>
+          </w:p>
+        </w:tc>
+        <w:tc>
+          <w:tcPr>
+            <w:tcW w:type="dxa" w:w="1881"/>
+            <w:shd w:val="clear" w:fill="E6E6DC"/>
+          </w:tcPr>
+          <w:p>
+            <w:r>
+              <w:rPr>
+                <w:b/>
+                <w:sz w:val="18"/>
+              </w:rPr>
+              <w:t>2025</w:t>
+            </w:r>
+          </w:p>
+        </w:tc>
+        <w:tc>
+          <w:tcPr>
+            <w:tcW w:type="dxa" w:w="1881"/>
+            <w:shd w:val="clear" w:fill="E6E6DC"/>
+          </w:tcPr>
+          <w:p>
+            <w:r>
+              <w:rPr>
+                <w:b/>
+                <w:sz w:val="18"/>
+              </w:rPr>
+              <w:t>Variation</w:t>
+            </w:r>
+          </w:p>
+        </w:tc>
+        <w:tc>
+          <w:tcPr>
+            <w:tcW w:type="dxa" w:w="1881"/>
+            <w:shd w:val="clear" w:fill="E6E6DC"/>
+          </w:tcPr>
+          <w:p>
+            <w:r>
+              <w:rPr>
+                <w:b/>
+                <w:sz w:val="18"/>
+              </w:rPr>
+              <w:t>Lecture</w:t>
+            </w:r>
+          </w:p>
+        </w:tc>
+      </w:tr>
+      <w:tr>
+        <w:tc>
+          <w:tcPr>
+            <w:tcW w:type="dxa" w:w="1881"/>
+          </w:tcPr>
+          <w:p>
+            <w:r>
+              <w:rPr>
+                <w:b/>
+                <w:sz w:val="19"/>
+              </w:rPr>
+              <w:t>Intensité carbone (t CO₂e / M€)</w:t>
+            </w:r>
+          </w:p>
+        </w:tc>
+        <w:tc>
+          <w:tcPr>
+            <w:tcW w:type="dxa" w:w="1881"/>
+          </w:tcPr>
+          <w:p>
+            <w:r>
+              <w:rPr>
+                <w:b w:val="0"/>
+                <w:sz w:val="19"/>
+              </w:rPr>
+              <w:t>197,8</w:t>
+            </w:r>
+          </w:p>
+        </w:tc>
+        <w:tc>
+          <w:tcPr>
+            <w:tcW w:type="dxa" w:w="1881"/>
+          </w:tcPr>
+          <w:p>
+            <w:r>
+              <w:rPr>
+                <w:b w:val="0"/>
+                <w:sz w:val="19"/>
+              </w:rPr>
+              <w:t>170,8</w:t>
+            </w:r>
+          </w:p>
+        </w:tc>
+        <w:tc>
+          <w:tcPr>
+            <w:tcW w:type="dxa" w:w="1881"/>
+          </w:tcPr>
+          <w:p>
+            <w:r>
+              <w:rPr>
+                <w:b w:val="0"/>
+                <w:sz w:val="19"/>
+              </w:rPr>
+              <w:t>-26,9</w:t>
+            </w:r>
+          </w:p>
+        </w:tc>
+        <w:tc>
+          <w:tcPr>
+            <w:tcW w:type="dxa" w:w="1881"/>
+          </w:tcPr>
+          <w:p>
+            <w:r>
+              <w:rPr>
+                <w:b w:val="0"/>
+                <w:sz w:val="19"/>
+              </w:rPr>
+              <w:t>en progrès</w:t>
+            </w:r>
+          </w:p>
+        </w:tc>
+      </w:tr>
+      <w:tr>
+        <w:tc>
+          <w:tcPr>
+            <w:tcW w:type="dxa" w:w="1881"/>
+          </w:tcPr>
+          <w:p>
+            <w:r>
+              <w:rPr>
+                <w:b/>
+                <w:sz w:val="19"/>
+              </w:rPr>
+              <w:t>Émissions totales de gaz à effet de serre</w:t>
+            </w:r>
+          </w:p>
+        </w:tc>
+        <w:tc>
+          <w:tcPr>
+            <w:tcW w:type="dxa" w:w="1881"/>
+          </w:tcPr>
+          <w:p>
+            <w:r>
+              <w:rPr>
+                <w:b w:val="0"/>
+                <w:sz w:val="19"/>
+              </w:rPr>
+              <w:t>8 900 t</w:t>
+            </w:r>
+          </w:p>
+        </w:tc>
+        <w:tc>
+          <w:tcPr>
+            <w:tcW w:type="dxa" w:w="1881"/>
+          </w:tcPr>
+          <w:p>
+            <w:r>
+              <w:rPr>
+                <w:b w:val="0"/>
+                <w:sz w:val="19"/>
+              </w:rPr>
+              <w:t>8 200 t</w:t>
+            </w:r>
+          </w:p>
+        </w:tc>
+        <w:tc>
+          <w:tcPr>
+            <w:tcW w:type="dxa" w:w="1881"/>
+          </w:tcPr>
+          <w:p>
+            <w:r>
+              <w:rPr>
+                <w:b w:val="0"/>
+                <w:sz w:val="19"/>
+              </w:rPr>
+              <w:t>-700 t</w:t>
+            </w:r>
+          </w:p>
+        </w:tc>
+        <w:tc>
+          <w:tcPr>
+            <w:tcW w:type="dxa" w:w="1881"/>
+          </w:tcPr>
+          <w:p>
+            <w:r>
+              <w:rPr>
+                <w:b w:val="0"/>
+                <w:sz w:val="19"/>
+              </w:rPr>
+              <w:t>—</w:t>
+            </w:r>
+          </w:p>
+        </w:tc>
+      </w:tr>
+      <w:tr>
+        <w:tc>
+          <w:tcPr>
+            <w:tcW w:type="dxa" w:w="1881"/>
+          </w:tcPr>
+          <w:p>
+            <w:r>
+              <w:rPr>
+                <w:b/>
+                <w:sz w:val="19"/>
+              </w:rPr>
+              <w:t>Consommation d'énergie</w:t>
+            </w:r>
+          </w:p>
+        </w:tc>
+        <w:tc>
+          <w:tcPr>
+            <w:tcW w:type="dxa" w:w="1881"/>
+          </w:tcPr>
+          <w:p>
+            <w:r>
+              <w:rPr>
+                <w:b w:val="0"/>
+                <w:sz w:val="19"/>
+              </w:rPr>
+              <w:t>22 800 MWh</w:t>
+            </w:r>
+          </w:p>
+        </w:tc>
+        <w:tc>
+          <w:tcPr>
+            <w:tcW w:type="dxa" w:w="1881"/>
+          </w:tcPr>
+          <w:p>
+            <w:r>
+              <w:rPr>
+                <w:b w:val="0"/>
+                <w:sz w:val="19"/>
+              </w:rPr>
+              <w:t>21 500 MWh</w:t>
+            </w:r>
+          </w:p>
+        </w:tc>
+        <w:tc>
+          <w:tcPr>
+            <w:tcW w:type="dxa" w:w="1881"/>
+          </w:tcPr>
+          <w:p>
+            <w:r>
+              <w:rPr>
+                <w:b w:val="0"/>
+                <w:sz w:val="19"/>
+              </w:rPr>
+              <w:t>-1 300 MWh</w:t>
+            </w:r>
+          </w:p>
+        </w:tc>
+        <w:tc>
+          <w:tcPr>
+            <w:tcW w:type="dxa" w:w="1881"/>
+          </w:tcPr>
+          <w:p>
+            <w:r>
+              <w:rPr>
+                <w:b w:val="0"/>
+                <w:sz w:val="19"/>
+              </w:rPr>
+              <w:t>—</w:t>
+            </w:r>
+          </w:p>
+        </w:tc>
+      </w:tr>
+      <w:tr>
+        <w:tc>
+          <w:tcPr>
+            <w:tcW w:type="dxa" w:w="1881"/>
+          </w:tcPr>
+          <w:p>
+            <w:r>
+              <w:rPr>
+                <w:b/>
+                <w:sz w:val="19"/>
+              </w:rPr>
+              <w:t>Part d'énergie renouvelable</w:t>
+            </w:r>
+          </w:p>
+        </w:tc>
+        <w:tc>
+          <w:tcPr>
+            <w:tcW w:type="dxa" w:w="1881"/>
+          </w:tcPr>
+          <w:p>
+            <w:r>
+              <w:rPr>
+                <w:b w:val="0"/>
+                <w:sz w:val="19"/>
+              </w:rPr>
+              <w:t>35 %</w:t>
+            </w:r>
+          </w:p>
+        </w:tc>
+        <w:tc>
+          <w:tcPr>
+            <w:tcW w:type="dxa" w:w="1881"/>
+          </w:tcPr>
+          <w:p>
+            <w:r>
+              <w:rPr>
+                <w:b w:val="0"/>
+                <w:sz w:val="19"/>
+              </w:rPr>
+              <w:t>42 %</w:t>
+            </w:r>
+          </w:p>
+        </w:tc>
+        <w:tc>
+          <w:tcPr>
+            <w:tcW w:type="dxa" w:w="1881"/>
+          </w:tcPr>
+          <w:p>
+            <w:r>
+              <w:rPr>
+                <w:b w:val="0"/>
+                <w:sz w:val="19"/>
+              </w:rPr>
+              <w:t>+7 pts</w:t>
+            </w:r>
+          </w:p>
+        </w:tc>
+        <w:tc>
+          <w:tcPr>
+            <w:tcW w:type="dxa" w:w="1881"/>
+          </w:tcPr>
+          <w:p>
+            <w:r>
+              <w:rPr>
+                <w:b w:val="0"/>
+                <w:sz w:val="19"/>
+              </w:rPr>
+              <w:t>en progrès</w:t>
+            </w:r>
+          </w:p>
+        </w:tc>
+      </w:tr>
+      <w:tr>
+        <w:tc>
+          <w:tcPr>
+            <w:tcW w:type="dxa" w:w="1881"/>
+          </w:tcPr>
+          <w:p>
+            <w:r>
+              <w:rPr>
+                <w:b/>
+                <w:sz w:val="19"/>
+              </w:rPr>
+              <w:t>Consommation d'eau</w:t>
+            </w:r>
+          </w:p>
+        </w:tc>
+        <w:tc>
+          <w:tcPr>
+            <w:tcW w:type="dxa" w:w="1881"/>
+          </w:tcPr>
+          <w:p>
+            <w:r>
+              <w:rPr>
+                <w:b w:val="0"/>
+                <w:sz w:val="19"/>
+              </w:rPr>
+              <w:t>115 000 m³</w:t>
+            </w:r>
+          </w:p>
+        </w:tc>
+        <w:tc>
+          <w:tcPr>
+            <w:tcW w:type="dxa" w:w="1881"/>
+          </w:tcPr>
+          <w:p>
+            <w:r>
+              <w:rPr>
+                <w:b w:val="0"/>
+                <w:sz w:val="19"/>
+              </w:rPr>
+              <w:t>120 000 m³</w:t>
+            </w:r>
+          </w:p>
+        </w:tc>
+        <w:tc>
+          <w:tcPr>
+            <w:tcW w:type="dxa" w:w="1881"/>
+          </w:tcPr>
+          <w:p>
+            <w:r>
+              <w:rPr>
+                <w:b w:val="0"/>
+                <w:sz w:val="19"/>
+              </w:rPr>
+              <w:t>+5 000 m³</w:t>
+            </w:r>
+          </w:p>
+        </w:tc>
+        <w:tc>
+          <w:tcPr>
+            <w:tcW w:type="dxa" w:w="1881"/>
+          </w:tcPr>
+          <w:p>
+            <w:r>
+              <w:rPr>
+                <w:b w:val="0"/>
+                <w:sz w:val="19"/>
+              </w:rPr>
+              <w:t>—</w:t>
+            </w:r>
+          </w:p>
+        </w:tc>
+      </w:tr>
+      <w:tr>
+        <w:tc>
+          <w:tcPr>
+            <w:tcW w:type="dxa" w:w="1881"/>
+          </w:tcPr>
+          <w:p>
+            <w:r>
+              <w:rPr>
+                <w:b/>
+                <w:sz w:val="19"/>
+              </w:rPr>
+              <w:t>Taux de valorisation des déchets</w:t>
+            </w:r>
+          </w:p>
+        </w:tc>
+        <w:tc>
+          <w:tcPr>
+            <w:tcW w:type="dxa" w:w="1881"/>
+          </w:tcPr>
+          <w:p>
+            <w:r>
+              <w:rPr>
+                <w:b w:val="0"/>
+                <w:sz w:val="19"/>
+              </w:rPr>
+              <w:t>58 %</w:t>
+            </w:r>
+          </w:p>
+        </w:tc>
+        <w:tc>
+          <w:tcPr>
+            <w:tcW w:type="dxa" w:w="1881"/>
+          </w:tcPr>
+          <w:p>
+            <w:r>
+              <w:rPr>
+                <w:b w:val="0"/>
+                <w:sz w:val="19"/>
+              </w:rPr>
+              <w:t>63 %</w:t>
+            </w:r>
+          </w:p>
+        </w:tc>
+        <w:tc>
+          <w:tcPr>
+            <w:tcW w:type="dxa" w:w="1881"/>
+          </w:tcPr>
+          <w:p>
+            <w:r>
+              <w:rPr>
+                <w:b w:val="0"/>
+                <w:sz w:val="19"/>
+              </w:rPr>
+              <w:t>+5 pts</w:t>
+            </w:r>
+          </w:p>
+        </w:tc>
+        <w:tc>
+          <w:tcPr>
+            <w:tcW w:type="dxa" w:w="1881"/>
+          </w:tcPr>
+          <w:p>
+            <w:r>
+              <w:rPr>
+                <w:b w:val="0"/>
+                <w:sz w:val="19"/>
+              </w:rPr>
+              <w:t>en progrès</w:t>
+            </w:r>
+          </w:p>
+        </w:tc>
+      </w:tr>
+      <w:tr>
+        <w:tc>
+          <w:tcPr>
+            <w:tcW w:type="dxa" w:w="1881"/>
+          </w:tcPr>
+          <w:p>
+            <w:r>
+              <w:rPr>
+                <w:b/>
+                <w:sz w:val="19"/>
+              </w:rPr>
+              <w:t>Effectif</w:t>
+            </w:r>
+          </w:p>
+        </w:tc>
+        <w:tc>
+          <w:tcPr>
+            <w:tcW w:type="dxa" w:w="1881"/>
+          </w:tcPr>
+          <w:p>
+            <w:r>
+              <w:rPr>
+                <w:b w:val="0"/>
+                <w:sz w:val="19"/>
+              </w:rPr>
+              <w:t>310</w:t>
+            </w:r>
+          </w:p>
+        </w:tc>
+        <w:tc>
+          <w:tcPr>
+            <w:tcW w:type="dxa" w:w="1881"/>
+          </w:tcPr>
+          <w:p>
+            <w:r>
+              <w:rPr>
+                <w:b w:val="0"/>
+                <w:sz w:val="19"/>
+              </w:rPr>
+              <w:t>320</w:t>
+            </w:r>
+          </w:p>
+        </w:tc>
+        <w:tc>
+          <w:tcPr>
+            <w:tcW w:type="dxa" w:w="1881"/>
+          </w:tcPr>
+          <w:p>
+            <w:r>
+              <w:rPr>
+                <w:b w:val="0"/>
+                <w:sz w:val="19"/>
+              </w:rPr>
+              <w:t>+10</w:t>
+            </w:r>
+          </w:p>
+        </w:tc>
+        <w:tc>
+          <w:tcPr>
+            <w:tcW w:type="dxa" w:w="1881"/>
+          </w:tcPr>
+          <w:p>
+            <w:r>
+              <w:rPr>
+                <w:b w:val="0"/>
+                <w:sz w:val="19"/>
+              </w:rPr>
+              <w:t>—</w:t>
+            </w:r>
+          </w:p>
+        </w:tc>
+      </w:tr>
+      <w:tr>
+        <w:tc>
+          <w:tcPr>
+            <w:tcW w:type="dxa" w:w="1881"/>
+          </w:tcPr>
+          <w:p>
+            <w:r>
+              <w:rPr>
+                <w:b/>
+                <w:sz w:val="19"/>
+              </w:rPr>
+              <w:t>Part de femmes</w:t>
+            </w:r>
+          </w:p>
+        </w:tc>
+        <w:tc>
+          <w:tcPr>
+            <w:tcW w:type="dxa" w:w="1881"/>
+          </w:tcPr>
+          <w:p>
+            <w:r>
+              <w:rPr>
+                <w:b w:val="0"/>
+                <w:sz w:val="19"/>
+              </w:rPr>
+              <w:t>33 %</w:t>
+            </w:r>
+          </w:p>
+        </w:tc>
+        <w:tc>
+          <w:tcPr>
+            <w:tcW w:type="dxa" w:w="1881"/>
+          </w:tcPr>
+          <w:p>
+            <w:r>
+              <w:rPr>
+                <w:b w:val="0"/>
+                <w:sz w:val="19"/>
+              </w:rPr>
+              <w:t>34 %</w:t>
+            </w:r>
+          </w:p>
+        </w:tc>
+        <w:tc>
+          <w:tcPr>
+            <w:tcW w:type="dxa" w:w="1881"/>
+          </w:tcPr>
+          <w:p>
+            <w:r>
+              <w:rPr>
+                <w:b w:val="0"/>
+                <w:sz w:val="19"/>
+              </w:rPr>
+              <w:t>+1 pt</w:t>
+            </w:r>
+          </w:p>
+        </w:tc>
+        <w:tc>
+          <w:tcPr>
+            <w:tcW w:type="dxa" w:w="1881"/>
+          </w:tcPr>
+          <w:p>
+            <w:r>
+              <w:rPr>
+                <w:b w:val="0"/>
+                <w:sz w:val="19"/>
+              </w:rPr>
+              <w:t>en progrès</w:t>
+            </w:r>
+          </w:p>
+        </w:tc>
+      </w:tr>
+      <w:tr>
+        <w:tc>
+          <w:tcPr>
+            <w:tcW w:type="dxa" w:w="1881"/>
+          </w:tcPr>
+          <w:p>
+            <w:r>
+              <w:rPr>
+                <w:b/>
+                <w:sz w:val="19"/>
+              </w:rPr>
+              <w:t>Taux de rotation</w:t>
+            </w:r>
+          </w:p>
+        </w:tc>
+        <w:tc>
+          <w:tcPr>
+            <w:tcW w:type="dxa" w:w="1881"/>
+          </w:tcPr>
+          <w:p>
+            <w:r>
+              <w:rPr>
+                <w:b w:val="0"/>
+                <w:sz w:val="19"/>
+              </w:rPr>
+              <w:t>13 %</w:t>
+            </w:r>
+          </w:p>
+        </w:tc>
+        <w:tc>
+          <w:tcPr>
+            <w:tcW w:type="dxa" w:w="1881"/>
+          </w:tcPr>
+          <w:p>
+            <w:r>
+              <w:rPr>
+                <w:b w:val="0"/>
+                <w:sz w:val="19"/>
+              </w:rPr>
+              <w:t>11 %</w:t>
+            </w:r>
+          </w:p>
+        </w:tc>
+        <w:tc>
+          <w:tcPr>
+            <w:tcW w:type="dxa" w:w="1881"/>
+          </w:tcPr>
+          <w:p>
+            <w:r>
+              <w:rPr>
+                <w:b w:val="0"/>
+                <w:sz w:val="19"/>
+              </w:rPr>
+              <w:t>-2 pts</w:t>
+            </w:r>
+          </w:p>
+        </w:tc>
+        <w:tc>
+          <w:tcPr>
+            <w:tcW w:type="dxa" w:w="1881"/>
+          </w:tcPr>
+          <w:p>
+            <w:r>
+              <w:rPr>
+                <w:b w:val="0"/>
+                <w:sz w:val="19"/>
+              </w:rPr>
+              <w:t>en progrès</w:t>
+            </w:r>
+          </w:p>
+        </w:tc>
+      </w:tr>
+      <w:tr>
+        <w:tc>
+          <w:tcPr>
+            <w:tcW w:type="dxa" w:w="1881"/>
+          </w:tcPr>
+          <w:p>
+            <w:r>
+              <w:rPr>
+                <w:b/>
+                <w:sz w:val="19"/>
+              </w:rPr>
+              <w:t>Heures de formation</w:t>
+            </w:r>
+          </w:p>
+        </w:tc>
+        <w:tc>
+          <w:tcPr>
+            <w:tcW w:type="dxa" w:w="1881"/>
+          </w:tcPr>
+          <w:p>
+            <w:r>
+              <w:rPr>
+                <w:b w:val="0"/>
+                <w:sz w:val="19"/>
+              </w:rPr>
+              <w:t>18 h</w:t>
+            </w:r>
+          </w:p>
+        </w:tc>
+        <w:tc>
+          <w:tcPr>
+            <w:tcW w:type="dxa" w:w="1881"/>
+          </w:tcPr>
+          <w:p>
+            <w:r>
+              <w:rPr>
+                <w:b w:val="0"/>
+                <w:sz w:val="19"/>
+              </w:rPr>
+              <w:t>22 h</w:t>
+            </w:r>
+          </w:p>
+        </w:tc>
+        <w:tc>
+          <w:tcPr>
+            <w:tcW w:type="dxa" w:w="1881"/>
+          </w:tcPr>
+          <w:p>
+            <w:r>
+              <w:rPr>
+                <w:b w:val="0"/>
+                <w:sz w:val="19"/>
+              </w:rPr>
+              <w:t>+4 h</w:t>
+            </w:r>
+          </w:p>
+        </w:tc>
+        <w:tc>
+          <w:tcPr>
+            <w:tcW w:type="dxa" w:w="1881"/>
+          </w:tcPr>
+          <w:p>
+            <w:r>
+              <w:rPr>
+                <w:b w:val="0"/>
+                <w:sz w:val="19"/>
+              </w:rPr>
+              <w:t>en progrès</w:t>
+            </w:r>
+          </w:p>
+        </w:tc>
+      </w:tr>
+      <w:tr>
+        <w:tc>
+          <w:tcPr>
+            <w:tcW w:type="dxa" w:w="1881"/>
+          </w:tcPr>
+          <w:p>
+            <w:r>
+              <w:rPr>
+                <w:b/>
+                <w:sz w:val="19"/>
+              </w:rPr>
+              <w:t>Taux de fréquence des accidents</w:t>
+            </w:r>
+          </w:p>
+        </w:tc>
+        <w:tc>
+          <w:tcPr>
+            <w:tcW w:type="dxa" w:w="1881"/>
+          </w:tcPr>
+          <w:p>
+            <w:r>
+              <w:rPr>
+                <w:b w:val="0"/>
+                <w:sz w:val="19"/>
+              </w:rPr>
+              <w:t>8,1</w:t>
+            </w:r>
+          </w:p>
+        </w:tc>
+        <w:tc>
+          <w:tcPr>
+            <w:tcW w:type="dxa" w:w="1881"/>
+          </w:tcPr>
+          <w:p>
+            <w:r>
+              <w:rPr>
+                <w:b w:val="0"/>
+                <w:sz w:val="19"/>
+              </w:rPr>
+              <w:t>6,2</w:t>
+            </w:r>
+          </w:p>
+        </w:tc>
+        <w:tc>
+          <w:tcPr>
+            <w:tcW w:type="dxa" w:w="1881"/>
+          </w:tcPr>
+          <w:p>
+            <w:r>
+              <w:rPr>
+                <w:b w:val="0"/>
+                <w:sz w:val="19"/>
+              </w:rPr>
+              <w:t>-1,9</w:t>
+            </w:r>
+          </w:p>
+        </w:tc>
+        <w:tc>
+          <w:tcPr>
+            <w:tcW w:type="dxa" w:w="1881"/>
+          </w:tcPr>
+          <w:p>
+            <w:r>
+              <w:rPr>
+                <w:b w:val="0"/>
+                <w:sz w:val="19"/>
+              </w:rPr>
+              <w:t>en progrès</w:t>
+            </w:r>
+          </w:p>
+        </w:tc>
+      </w:tr>
+      <w:tr>
+        <w:tc>
+          <w:tcPr>
+            <w:tcW w:type="dxa" w:w="1881"/>
+          </w:tcPr>
+          <w:p>
+            <w:r>
+              <w:rPr>
+                <w:b/>
+                <w:sz w:val="19"/>
+              </w:rPr>
+              <w:t>Part de femmes au conseil</w:t>
+            </w:r>
+          </w:p>
+        </w:tc>
+        <w:tc>
+          <w:tcPr>
+            <w:tcW w:type="dxa" w:w="1881"/>
+          </w:tcPr>
+          <w:p>
+            <w:r>
+              <w:rPr>
+                <w:b w:val="0"/>
+                <w:sz w:val="19"/>
+              </w:rPr>
+              <w:t>44 %</w:t>
+            </w:r>
+          </w:p>
+        </w:tc>
+        <w:tc>
+          <w:tcPr>
+            <w:tcW w:type="dxa" w:w="1881"/>
+          </w:tcPr>
+          <w:p>
+            <w:r>
+              <w:rPr>
+                <w:b w:val="0"/>
+                <w:sz w:val="19"/>
+              </w:rPr>
+              <w:t>44 %</w:t>
+            </w:r>
+          </w:p>
+        </w:tc>
+        <w:tc>
+          <w:tcPr>
+            <w:tcW w:type="dxa" w:w="1881"/>
+          </w:tcPr>
+          <w:p>
+            <w:r>
+              <w:rPr>
+                <w:b w:val="0"/>
+                <w:sz w:val="19"/>
+              </w:rPr>
+              <w:t>0 pt</w:t>
+            </w:r>
+          </w:p>
+        </w:tc>
+        <w:tc>
+          <w:tcPr>
+            <w:tcW w:type="dxa" w:w="1881"/>
+          </w:tcPr>
+          <w:p>
+            <w:r>
+              <w:rPr>
+                <w:b w:val="0"/>
+                <w:sz w:val="19"/>
+              </w:rPr>
+              <w:t>stable</w:t>
+            </w:r>
+          </w:p>
+        </w:tc>
+      </w:tr>
+      <w:tr>
+        <w:tc>
+          <w:tcPr>
+            <w:tcW w:type="dxa" w:w="1881"/>
+          </w:tcPr>
+          <w:p>
+            <w:r>
+              <w:rPr>
+                <w:b/>
+                <w:sz w:val="19"/>
+              </w:rPr>
+              <w:t>Part d'administrateurs indépendants</w:t>
+            </w:r>
+          </w:p>
+        </w:tc>
+        <w:tc>
+          <w:tcPr>
+            <w:tcW w:type="dxa" w:w="1881"/>
+          </w:tcPr>
+          <w:p>
+            <w:r>
+              <w:rPr>
+                <w:b w:val="0"/>
+                <w:sz w:val="19"/>
+              </w:rPr>
+              <w:t>45 %</w:t>
+            </w:r>
+          </w:p>
+        </w:tc>
+        <w:tc>
+          <w:tcPr>
+            <w:tcW w:type="dxa" w:w="1881"/>
+          </w:tcPr>
+          <w:p>
+            <w:r>
+              <w:rPr>
+                <w:b w:val="0"/>
+                <w:sz w:val="19"/>
+              </w:rPr>
+              <w:t>45 %</w:t>
+            </w:r>
+          </w:p>
+        </w:tc>
+        <w:tc>
+          <w:tcPr>
+            <w:tcW w:type="dxa" w:w="1881"/>
+          </w:tcPr>
+          <w:p>
+            <w:r>
+              <w:rPr>
+                <w:b w:val="0"/>
+                <w:sz w:val="19"/>
+              </w:rPr>
+              <w:t>0 pt</w:t>
+            </w:r>
+          </w:p>
+        </w:tc>
+        <w:tc>
+          <w:tcPr>
+            <w:tcW w:type="dxa" w:w="1881"/>
+          </w:tcPr>
+          <w:p>
+            <w:r>
+              <w:rPr>
+                <w:b w:val="0"/>
+                <w:sz w:val="19"/>
+              </w:rPr>
+              <w:t>stable</w:t>
+            </w:r>
+          </w:p>
+        </w:tc>
+      </w:tr>
+      <w:tr>
+        <w:tc>
+          <w:tcPr>
+            <w:tcW w:type="dxa" w:w="1881"/>
+          </w:tcPr>
+          <w:p>
+            <w:r>
+              <w:rPr>
+                <w:b/>
+                <w:sz w:val="19"/>
+              </w:rPr>
+              <w:t>Manquements éthiques</w:t>
+            </w:r>
+          </w:p>
+        </w:tc>
+        <w:tc>
+          <w:tcPr>
+            <w:tcW w:type="dxa" w:w="1881"/>
+          </w:tcPr>
+          <w:p>
+            <w:r>
+              <w:rPr>
+                <w:b w:val="0"/>
+                <w:sz w:val="19"/>
+              </w:rPr>
+              <w:t>0</w:t>
+            </w:r>
+          </w:p>
+        </w:tc>
+        <w:tc>
+          <w:tcPr>
+            <w:tcW w:type="dxa" w:w="1881"/>
+          </w:tcPr>
+          <w:p>
+            <w:r>
+              <w:rPr>
+                <w:b w:val="0"/>
+                <w:sz w:val="19"/>
+              </w:rPr>
+              <w:t>0</w:t>
+            </w:r>
+          </w:p>
+        </w:tc>
+        <w:tc>
+          <w:tcPr>
+            <w:tcW w:type="dxa" w:w="1881"/>
+          </w:tcPr>
+          <w:p>
+            <w:r>
+              <w:rPr>
+                <w:b w:val="0"/>
+                <w:sz w:val="19"/>
+              </w:rPr>
+              <w:t>0</w:t>
+            </w:r>
+          </w:p>
+        </w:tc>
+        <w:tc>
+          <w:tcPr>
+            <w:tcW w:type="dxa" w:w="1881"/>
+          </w:tcPr>
+          <w:p>
+            <w:r>
+              <w:rPr>
+                <w:b w:val="0"/>
+                <w:sz w:val="19"/>
+              </w:rPr>
+              <w:t>stable</w:t>
+            </w:r>
+          </w:p>
+        </w:tc>
+      </w:tr>
+      <w:tr>
+        <w:tc>
+          <w:tcPr>
+            <w:tcW w:type="dxa" w:w="1881"/>
+          </w:tcPr>
+          <w:p>
+            <w:r>
+              <w:rPr>
+                <w:b/>
+                <w:sz w:val="19"/>
+              </w:rPr>
+              <w:t>Incidents de cybersécurité</w:t>
+            </w:r>
+          </w:p>
+        </w:tc>
+        <w:tc>
+          <w:tcPr>
+            <w:tcW w:type="dxa" w:w="1881"/>
+          </w:tcPr>
+          <w:p>
+            <w:r>
+              <w:rPr>
+                <w:b w:val="0"/>
+                <w:sz w:val="19"/>
+              </w:rPr>
+              <w:t>0</w:t>
+            </w:r>
+          </w:p>
+        </w:tc>
+        <w:tc>
+          <w:tcPr>
+            <w:tcW w:type="dxa" w:w="1881"/>
+          </w:tcPr>
+          <w:p>
+            <w:r>
+              <w:rPr>
+                <w:b w:val="0"/>
+                <w:sz w:val="19"/>
+              </w:rPr>
+              <w:t>1</w:t>
+            </w:r>
+          </w:p>
+        </w:tc>
+        <w:tc>
+          <w:tcPr>
+            <w:tcW w:type="dxa" w:w="1881"/>
+          </w:tcPr>
+          <w:p>
+            <w:r>
+              <w:rPr>
+                <w:b w:val="0"/>
+                <w:sz w:val="19"/>
+              </w:rPr>
+              <w:t>+1</w:t>
+            </w:r>
+          </w:p>
+        </w:tc>
+        <w:tc>
+          <w:tcPr>
+            <w:tcW w:type="dxa" w:w="1881"/>
+          </w:tcPr>
+          <w:p>
+            <w:r>
+              <w:rPr>
+                <w:b w:val="0"/>
+                <w:sz w:val="19"/>
+              </w:rPr>
+              <w:t>en recul</w:t>
+            </w:r>
+          </w:p>
+        </w:tc>
+      </w:tr>
+      <w:tr>
+        <w:tc>
+          <w:tcPr>
+            <w:tcW w:type="dxa" w:w="1881"/>
+          </w:tcPr>
+          <w:p>
+            <w:r>
+              <w:rPr>
+                <w:b/>
+                <w:sz w:val="19"/>
+              </w:rPr>
+              <w:t>Audit ESG</w:t>
+            </w:r>
+          </w:p>
+        </w:tc>
+        <w:tc>
+          <w:tcPr>
+            <w:tcW w:type="dxa" w:w="1881"/>
+          </w:tcPr>
+          <w:p>
+            <w:r>
+              <w:rPr>
+                <w:b w:val="0"/>
+                <w:sz w:val="19"/>
+              </w:rPr>
+              <w:t>non</w:t>
+            </w:r>
+          </w:p>
+        </w:tc>
+        <w:tc>
+          <w:tcPr>
+            <w:tcW w:type="dxa" w:w="1881"/>
+          </w:tcPr>
+          <w:p>
+            <w:r>
+              <w:rPr>
+                <w:b w:val="0"/>
+                <w:sz w:val="19"/>
+              </w:rPr>
+              <w:t>non</w:t>
+            </w:r>
+          </w:p>
+        </w:tc>
+        <w:tc>
+          <w:tcPr>
+            <w:tcW w:type="dxa" w:w="1881"/>
+          </w:tcPr>
+          <w:p>
+            <w:r>
+              <w:rPr>
+                <w:b w:val="0"/>
+                <w:sz w:val="19"/>
+              </w:rPr>
+              <w:t>—</w:t>
+            </w:r>
+          </w:p>
+        </w:tc>
+        <w:tc>
+          <w:tcPr>
+            <w:tcW w:type="dxa" w:w="1881"/>
+          </w:tcPr>
+          <w:p>
+            <w:r>
+              <w:rPr>
+                <w:b w:val="0"/>
+                <w:sz w:val="19"/>
+              </w:rPr>
+              <w:t>stable</w:t>
+            </w:r>
+          </w:p>
+        </w:tc>
+      </w:tr>
+      <w:tr>
+        <w:tc>
+          <w:tcPr>
+            <w:tcW w:type="dxa" w:w="1881"/>
+          </w:tcPr>
+          <w:p>
+            <w:r>
+              <w:rPr>
+                <w:b/>
+                <w:sz w:val="19"/>
+              </w:rPr>
+              <w:t>Comité de durabilité</w:t>
+            </w:r>
+          </w:p>
+        </w:tc>
+        <w:tc>
+          <w:tcPr>
+            <w:tcW w:type="dxa" w:w="1881"/>
+          </w:tcPr>
+          <w:p>
+            <w:r>
+              <w:rPr>
+                <w:b w:val="0"/>
+                <w:sz w:val="19"/>
+              </w:rPr>
+              <w:t>oui</w:t>
+            </w:r>
+          </w:p>
+        </w:tc>
+        <w:tc>
+          <w:tcPr>
+            <w:tcW w:type="dxa" w:w="1881"/>
+          </w:tcPr>
+          <w:p>
+            <w:r>
+              <w:rPr>
+                <w:b w:val="0"/>
+                <w:sz w:val="19"/>
+              </w:rPr>
+              <w:t>oui</w:t>
+            </w:r>
+          </w:p>
+        </w:tc>
+        <w:tc>
+          <w:tcPr>
+            <w:tcW w:type="dxa" w:w="1881"/>
+          </w:tcPr>
+          <w:p>
+            <w:r>
+              <w:rPr>
+                <w:b w:val="0"/>
+                <w:sz w:val="19"/>
+              </w:rPr>
+              <w:t>—</w:t>
+            </w:r>
+          </w:p>
+        </w:tc>
+        <w:tc>
+          <w:tcPr>
+            <w:tcW w:type="dxa" w:w="1881"/>
+          </w:tcPr>
+          <w:p>
+            <w:r>
+              <w:rPr>
+                <w:b w:val="0"/>
+                <w:sz w:val="19"/>
+              </w:rPr>
+              <w:t>stable</w:t>
+            </w:r>
+          </w:p>
+        </w:tc>
+      </w:tr>
+    </w:tbl>
+    <w:p/>
     <w:p>
       <w:r>
         <w:rPr>
@@ -3900,7 +5238,7 @@
               <w:rPr>
                 <w:sz w:val="18"/>
               </w:rPr>
-              <w:t>Cible déclarée : −42 % entre 2025 et 2030 (scopes 1 et 2)</w:t>
+              <w:t>Cible déclarée : -42 % entre 2025 et 2030 (scopes 1 et 2)</w:t>
             </w:r>
           </w:p>
         </w:tc>
@@ -4412,7 +5750,7 @@
           <w:color w:val="5A6572"/>
           <w:sz w:val="17"/>
         </w:rPr>
-        <w:t>Périmètre et méthodologie du reporting. Référentiel visé : CSRD / ESRS. Le référentiel CSRD / ESRS sert ici de cadre de lecture ; le rapport ne se prononce pas sur l'assujettissement de l'entreprise à la CSRD. Pour mémoire, la loi n° 2025-391 du 30 avril 2025 a reporté aux exercices ouverts à compter de 2027 l'obligation des grandes entreprises qui n'y étaient pas soumises dès 2024, et la directive (UE) 2026/470, à transposer au plus tard le 19 mars 2027, la réserve aux entreprises de plus de 1 000 salariés réalisant plus de 450 M€ de chiffre d'affaires net. Les indicateurs couvrent l'exercice 2025 selon l'approche du contrôle opérationnel. Les émissions de gaz à effet de serre sont calculées selon le GHG Protocol (Scopes 1, 2 et 3) ; les indicateurs sociaux suivent les définitions de la norme ESRS S1 ; les indicateurs de gouvernance sont documentés à partir des registres de l'entreprise. Les scores par pilier (0-100) agrègent chaque indicateur sur une GRILLE DE NOTATION INTERNE, propre à l'outil : ses seuils ont été définis en interne et ne sont adossés à aucun référentiel externe publié. L'intensité carbone est notée sur une grille différenciée par famille sectorielle (services, industrie, transport, énergie…), elle aussi interne. La mixité de l'effectif est lue au regard de repères internes au diagnostic (40 % de femmes sépare un point fort d'un axe d'amélioration ; paliers de notation à 15/25/35/45 %) : aucun quota légal ne porte sur la mixité de l'effectif total. La grille du taux de fréquence des accidents est ancrée sur le taux national publié par l'Assurance Maladie (16,0 en 2024, tous secteurs ; Assurance Maladie – Risques professionnels, rapport annuel 2024, tableau 8). Le score global est la moyenne pondérée des piliers notés (pondérations 40/35/25, renormalisées quand un pilier n'est pas noté) ; un pilier n'est noté qu'à partir de 3 indicateurs de sa grille (seuil interne à l'outil) — en deçà, il n'est pas noté plutôt que de recevoir un score, et le nombre d'indicateurs notés figure à côté de chaque score ; sous deux piliers notés il n'y a ni score global ni notation lettrée. Une évolution d'un exercice à l'autre compare des scores globaux qui peuvent reposer sur des piliers différents. La notation lettrée (échelle interne AAA-CCC) est indicative — elle ne constitue pas une notation d'agence. Le rapport ne comporte aucune comparaison à un référentiel sectoriel externe : le positionnement présenté est interne, il compare les trois piliers entre eux. Aucun transfert de données externe n'a lieu — l'ensemble du rapport est produit localement. Périmètre : ce rapport documente les indicateurs collectés pour l'exercice — bilan d'émissions par scope, indicateurs sociaux et de gouvernance, et parts déclarées comme alignées à la Taxonomie UE lorsqu'elles sont renseignées. Il ne constitue ni une vérification par un tiers, ni une déclaration de conformité à un cadre de reporting, ni un engagement de l'organisation. Limites : certains indicateurs reposent sur des données déclaratives et des estimations ; ils sont affinés à mesure que les dispositifs de mesure gagnent en maturité. Les points de données suivants restent à consolider : la vérification par un tiers indépendant (assurance limitée, exigée des entreprises soumises à la CSRD).</w:t>
+        <w:t>Périmètre et méthodologie du reporting. Référentiel visé : CSRD / ESRS. Le référentiel CSRD / ESRS sert ici de cadre de lecture ; le rapport ne se prononce pas sur l'assujettissement de l'entreprise à la CSRD. Pour mémoire, la loi n° 2025-391 du 30 avril 2025 a reporté aux exercices ouverts à compter de 2027 l'obligation des grandes entreprises qui n'y étaient pas soumises dès 2024, et la directive (UE) 2026/470, à transposer au plus tard le 19 mars 2027, la réserve aux entreprises de plus de 1 000 salariés réalisant plus de 450 M€ de chiffre d'affaires net. Les indicateurs couvrent l'exercice 2025 selon l'approche du contrôle opérationnel. Les émissions de gaz à effet de serre sont calculées selon le GHG Protocol (Scopes 1, 2 et 3) ; les indicateurs sociaux suivent les définitions de la norme ESRS S1 ; les indicateurs de gouvernance sont documentés à partir des registres de l'entreprise. Les scores par pilier (0-100) agrègent chaque indicateur sur une GRILLE DE NOTATION INTERNE, propre à l'outil : ses seuils ont été définis en interne et ne sont adossés à aucun référentiel externe publié. L'intensité carbone est notée sur une grille différenciée par famille sectorielle (services, industrie, transport, énergie…), elle aussi interne. La mixité de l'effectif est lue au regard de repères internes au diagnostic (40 % de femmes sépare un point fort d'un axe d'amélioration ; paliers de notation à 15/25/35/45 %) : aucun quota légal ne porte sur la mixité de l'effectif total. La grille du taux de fréquence des accidents est ancrée sur le taux national publié par l'Assurance Maladie (16,0 en 2024, tous secteurs ; Assurance Maladie – Risques professionnels, rapport annuel 2024, tableau 8). Le score global est la moyenne pondérée des piliers notés (pondérations 40/35/25, renormalisées quand un pilier n'est pas noté) ; un pilier n'est noté qu'à partir de 3 indicateurs de sa grille (seuil interne à l'outil) — en deçà, il n'est pas noté plutôt que de recevoir un score, et le nombre d'indicateurs notés figure à côté de chaque score ; sous deux piliers notés il n'y a ni score global ni notation lettrée. Une évolution d'un exercice à l'autre compare des scores globaux qui peuvent reposer sur des piliers différents ; quand les indicateurs d'un exercice passé sont conservés dans le dossier, son score est recalculé selon la grille actuelle, sinon il est repris tel qu'il a été calculé à l'époque, selon la grille alors en vigueur. La notation lettrée (échelle interne AAA-CCC) est indicative — elle ne constitue pas une notation d'agence. Le rapport ne comporte aucune comparaison à un référentiel sectoriel externe : le positionnement présenté est interne, il compare les trois piliers entre eux. Aucun transfert de données externe n'a lieu — l'ensemble du rapport est produit localement. Périmètre : ce rapport documente les indicateurs collectés pour l'exercice — bilan d'émissions par scope, indicateurs sociaux et de gouvernance, et parts déclarées comme alignées à la Taxonomie UE lorsqu'elles sont renseignées. Il ne constitue ni une vérification par un tiers, ni une déclaration de conformité à un cadre de reporting, ni un engagement de l'organisation. Limites : certains indicateurs reposent sur des données déclaratives et des estimations ; ils sont affinés à mesure que les dispositifs de mesure gagnent en maturité. Les points de données suivants restent à consolider : la vérification par un tiers indépendant (assurance limitée, exigée des entreprises soumises à la CSRD).</w:t>
       </w:r>
     </w:p>
     <w:p>

</xml_diff>